<commit_message>
JSON data management: enemies/dungeons/food/shop/recipes moved to data/*.json
</commit_message>
<xml_diff>
--- a/アンディーメンテ作品におけるハクスラ系ゲームシステムの統合的解析とゲームデザイン設計要件.docx
+++ b/アンディーメンテ作品におけるハクスラ系ゲームシステムの統合的解析とゲームデザイン設計要件.docx
@@ -34,7 +34,144 @@
     </w:p>
     <w:p>
       <w:r>
-        <w:t>1997年よりインディーゲームシーンで活動を続ける「アンディーメンテ（Andymente）」は、独特の世界観と極めて中毒性の高いゲームシステムを融合させた作品群で根強い支持を集めているデベロッパーである</w:t>
+        <w:t>1997年よりインディーゲームシーンで活動を続ける「アンディーメンテ（</w:t>
+      </w:r>
+      <w:proofErr w:type="spellStart"/>
+      <w:r>
+        <w:t>Andymente</w:t>
+      </w:r>
+      <w:proofErr w:type="spellEnd"/>
+      <w:r>
+        <w:t>）」は、独特の世界観と極めて中毒性の高いゲームシステムを融合させた作品群で根強い支持を集めているデベロッパーである。同デベロッパーの代表作には、『アールエス（RS）』や『ライヂング☆スター』シリーズ、『アポロガル・エピソード』といった重量級のRPGから、『ぢきゅうぢそく』『きみの島 -KIMI NO SIMA-』などの生活・経営シミュレーションまで多岐にわたるジャンルが存在する。これらの作品群の根底に共通して流れているのは、プレイヤーの時間を数百時間にわたって吸収する「ハック＆スラッシュ（ハクスラ）」と「やり込み」の緻密なシステム構造である。</w:t>
+      </w:r>
+    </w:p>
+    <w:p>
+      <w:r>
+        <w:t>本稿は、ゲーム制作におけるプロンプト（AIへの指示書や仕様書の基盤）として活用されることを目的とし、アンディーメンテのハクスラ系ゲームに共通する「ゲームシステムの特徴」を漏れなく抽出し、解剖する。同氏のゲームデザインは、単に敵を倒してアイテムを得るという旧来のハクスラ構造にとどまらない。プレイヤーの移動経路そのものをリソース化する概念、パラメーターの複雑な相関関係、シミュレーションゲーム（生活・経営）との融合、そして意図的に情報を制限しプレイヤーに解読を促すユーザー体験（UX）など、極めて多層的なメカニクスによって構築されている。</w:t>
+      </w:r>
+    </w:p>
+    <w:p>
+      <w:r>
+        <w:t>以下に、戦闘メカニクス、パラメーターと育成アーキテクチャ、シミュレーション要素の統合、そしてメタ構造という観点から、アンディーメンテ的ハクスラシステムを完全に分解し、体系化して論述する。</w:t>
+      </w:r>
+    </w:p>
+    <w:p>
+      <w:pPr>
+        <w:rPr>
+          <w:b/>
+          <w:bCs/>
+        </w:rPr>
+      </w:pPr>
+      <w:r>
+        <w:rPr>
+          <w:b/>
+          <w:bCs/>
+        </w:rPr>
+        <w:t>2. コア・バトルシステムの解剖：リスク管理と高速フィードバック</w:t>
+      </w:r>
+    </w:p>
+    <w:p>
+      <w:r>
+        <w:t>アンディーメンテの戦闘システムは、視覚的な派手さやアクション性よりも「計算論的な美しさ」と「プレイヤーの選択の連続性」に重きを置いている。特にRPG系タイトルにおいて、戦闘はプレイヤーの思考を試すパズル的要素と、高速なフィードバックによるカタルシスを両立させる装置として機能している。</w:t>
+      </w:r>
+    </w:p>
+    <w:p>
+      <w:pPr>
+        <w:rPr>
+          <w:b/>
+          <w:bCs/>
+        </w:rPr>
+      </w:pPr>
+      <w:r>
+        <w:rPr>
+          <w:b/>
+          <w:bCs/>
+        </w:rPr>
+        <w:t>2.1 超高速戦闘と情報出力の極限化</w:t>
+      </w:r>
+    </w:p>
+    <w:p>
+      <w:r>
+        <w:t>ハック＆スラッシュの最大の課題は、戦闘の反復による作業感（Fatigue）の蓄積である。アンディーメンテのRPG作品では、この問題を解決するために戦闘のテンポが極限まで高速化されている。ボス戦などの重大な局面を除き、通常のエンカウント戦闘は極めて短い時間（場合によっては数秒から一瞬）で決着がつくように設計されている。</w:t>
+      </w:r>
+    </w:p>
+    <w:p>
+      <w:r>
+        <w:t>この高速化を支えているのが、テキストログによるフィードバックシステムである。過度なアニメーションの待機時間を最小限に抑え、猛烈なスピードでテキストログが流れ、ステータスが変動していく様子が視覚化される。これにより、プレイヤーは「圧倒的な速度で敵を粉砕し、自らのパラメーターがインフレーションしていく」という全能感（トランス状態）に浸ることができる。また、一部のシステムにおいては、プレイヤーの任意で戦</w:t>
+      </w:r>
+      <w:r>
+        <w:lastRenderedPageBreak/>
+        <w:t>闘のテンポ（テンション）を上げることができるが、これは自身の攻撃力が上がるわけではなく、純粋に「ダメージを受ける速度」も上がる仕様となっている。安易な高速化は死に直結するという、絶妙なリスク・リターンの罠が戦闘システム自体に組み込まれているのである。</w:t>
+      </w:r>
+    </w:p>
+    <w:p>
+      <w:pPr>
+        <w:rPr>
+          <w:b/>
+          <w:bCs/>
+        </w:rPr>
+      </w:pPr>
+      <w:r>
+        <w:rPr>
+          <w:b/>
+          <w:bCs/>
+        </w:rPr>
+        <w:t>2.2 空間的リスク管理としての「スタックシステム」</w:t>
+      </w:r>
+    </w:p>
+    <w:p>
+      <w:r>
+        <w:t>『ライヂング☆スター』シリーズなどで採用されている戦闘システムは、エンカウントの概念を空間的かつ戦略的に再構築している。一般的なRPGのように敵に触れると即座に戦闘画面に移行するのではなく、フィールド上の敵に触れた「方向」に敵がストック（蓄積）されていくという独特のメカニクスが存在する。</w:t>
+      </w:r>
+    </w:p>
+    <w:p>
+      <w:r>
+        <w:t>プレイヤーは、ストックされた複数の敵と一括して戦闘を行うことができる。大量の敵を一度に処理すれば、経験値やアイテム収集の効率は劇的に跳ね上がる。しかし、プレイヤー自身の処理能力（現在のステータスや装備ビルド）を超えた数を溜め込みすぎると、戦闘開始と同時に瞬く間にゲームオーバーとなる。このシステムは、プレイヤーに対して「現在の自分のビルドで、何匹までなら同時に捌けるか」というチキンレースを常に強要する。これにより、単調になりがちなザコ敵との戦闘作業が、能動的なリスク管理と限界への挑戦という高度なゲームプレイへと昇華されている。</w:t>
+      </w:r>
+    </w:p>
+    <w:p>
+      <w:pPr>
+        <w:rPr>
+          <w:b/>
+          <w:bCs/>
+        </w:rPr>
+      </w:pPr>
+      <w:r>
+        <w:rPr>
+          <w:b/>
+          <w:bCs/>
+        </w:rPr>
+        <w:t>2.3 リソースの連続性：移動と戦闘のトレードオフ</w:t>
+      </w:r>
+    </w:p>
+    <w:p>
+      <w:r>
+        <w:t>マップの探索行動そのものに戦略的リソースを絡ませる手法も、アンディーメンテ作品における際立った特徴である。歩数をベースとしたパラメーター振り分け型の探索システムが採用されることが多く、マップを「歩く」こと自体が探索、戦闘、アイテム収集のトリガーとなる。</w:t>
+      </w:r>
+    </w:p>
+    <w:p>
+      <w:r>
+        <w:t>ここで重要になるのが、移動時のスタミナ（SP）と戦闘時のスキルポイント（SP）の連続性である。実際のゲーム展開において、移動用のSPと戦闘用のSPは別システムとして機能しているものの、戦闘突入時には「移動時のSPを半分だけ持ち込める」といった強烈な制約が課される仕様が存在する。このメカニクスにより、「強力なアイテムを取るために遠回りをして移動SPを消費するか」、それとも「万全のSPを保って特殊攻撃を連発するために最短ルートでボスに挑むか」という、探索と戦闘の間に深刻な駆け引き（トレードオフ）が生じる。プレイヤーは常にマップの踏破ルートを最適化するパズルを解くことを求められる。</w:t>
+      </w:r>
+    </w:p>
+    <w:p>
+      <w:pPr>
+        <w:rPr>
+          <w:b/>
+          <w:bCs/>
+        </w:rPr>
+      </w:pPr>
+      <w:r>
+        <w:rPr>
+          <w:b/>
+          <w:bCs/>
+        </w:rPr>
+        <w:t>2.4 ノンフィールド進行とストイックな選択の連続</w:t>
+      </w:r>
+    </w:p>
+    <w:p>
+      <w:r>
+        <w:t>一部の作品においては、キャラクターを操作して歩き回るフィールドマップを完全に排除し、「前に進む」「戦う」「逃げる」といった極めて限定的なテキストコマンドの選択のみで進行する「ノンフィールドRPG」の形式が採用されている</w:t>
       </w:r>
       <w:r>
         <w:rPr>
@@ -43,7 +180,7 @@
         <w:t>1</w:t>
       </w:r>
       <w:r>
-        <w:t>。同デベロッパーの代表作には、『アールエス（RS）』や『ライヂング☆スター』シリーズ、『アポロガル・エピソード』といった重量級のRPGから、『ぢきゅうぢそく』『きみの島 -KIMI NO SIMA-』などの生活・経営シミュレーションまで多岐にわたるジャンルが存在する</w:t>
+        <w:t>。 このシステムは、余分な探索要素を削ぎ落とすことで、死ねばそこで全てが終わるというストイックなローグライク的緊張感を生み出している</w:t>
       </w:r>
       <w:r>
         <w:rPr>
@@ -52,226 +189,17 @@
         <w:t>2</w:t>
       </w:r>
       <w:r>
-        <w:t>。これらの作品群の根底に共通して流れているのは、プレイヤーの時間を数百時間にわたって吸収する「ハック＆スラッシュ（ハクスラ）」と「やり込み」の緻密なシステム構造である</w:t>
+        <w:t>。プレイヤーは自身の残りリソースと、次の選択がもたらすであろう危険度を常に天秤にかけながら進行しなければならず、極限までシンプル化され</w:t>
+      </w:r>
+      <w:r>
+        <w:lastRenderedPageBreak/>
+        <w:t>たUIデザインでありながら強烈な中毒性を持っている</w:t>
       </w:r>
       <w:r>
         <w:rPr>
           <w:vertAlign w:val="superscript"/>
         </w:rPr>
         <w:t>1</w:t>
-      </w:r>
-      <w:r>
-        <w:t>。</w:t>
-      </w:r>
-    </w:p>
-    <w:p>
-      <w:r>
-        <w:t>本稿は、ゲーム制作におけるプロンプト（AIへの指示書や仕様書の基盤）として活用されることを目的とし、アンディーメンテのハクスラ系ゲームに共通する「ゲームシステムの特徴」を漏れなく抽出し、解剖する。同氏のゲームデザインは、単に敵を倒してアイテムを得るという旧来のハクスラ構造にとどまらない。プレイヤーの移動経路そのものをリソース化する概念、パラメーターの複雑な相関関係、シミュレーションゲーム（生活・経営）との融合、そして意図的に情報を制限しプレイヤーに解読を促すユーザー体験（UX）など、極めて多層的なメカニクスによって構築されている</w:t>
-      </w:r>
-      <w:r>
-        <w:rPr>
-          <w:vertAlign w:val="superscript"/>
-        </w:rPr>
-        <w:t>9</w:t>
-      </w:r>
-      <w:r>
-        <w:t>。</w:t>
-      </w:r>
-    </w:p>
-    <w:p>
-      <w:r>
-        <w:t>以下に、戦闘メカニクス、パラメーターと育成アーキテクチャ、シミュレーション要素の統合、そしてメタ構造という観点から、アンディーメンテ的ハクスラシステムを完全に分解し、体系化して論述する。</w:t>
-      </w:r>
-    </w:p>
-    <w:p>
-      <w:pPr>
-        <w:rPr>
-          <w:b/>
-          <w:bCs/>
-        </w:rPr>
-      </w:pPr>
-      <w:r>
-        <w:rPr>
-          <w:b/>
-          <w:bCs/>
-        </w:rPr>
-        <w:t>2. コア・バトルシステムの解剖：リスク管理と高速フィードバック</w:t>
-      </w:r>
-    </w:p>
-    <w:p>
-      <w:r>
-        <w:t>アンディーメンテの戦闘システムは、視覚的な派手さやアクション性よりも「計算論的な美しさ」と「プレイヤーの選択の連続性」に重きを置いている。特にRPG系タイトルにおいて、戦闘はプレイヤーの思考を試すパズル的要素と、高速なフィードバックによるカタルシスを両立させる装置として機能している。</w:t>
-      </w:r>
-    </w:p>
-    <w:p>
-      <w:pPr>
-        <w:rPr>
-          <w:b/>
-          <w:bCs/>
-        </w:rPr>
-      </w:pPr>
-      <w:r>
-        <w:rPr>
-          <w:b/>
-          <w:bCs/>
-        </w:rPr>
-        <w:t>2.1 超高速戦闘と情報出力の極限化</w:t>
-      </w:r>
-    </w:p>
-    <w:p>
-      <w:r>
-        <w:t>ハック＆スラッシュの最大の課題は、戦闘の反復による作業感（Fatigue）の蓄積である。アンディーメンテのRPG作品では、この問題を解決するために戦闘のテンポが極限まで高速化されている</w:t>
-      </w:r>
-      <w:r>
-        <w:rPr>
-          <w:vertAlign w:val="superscript"/>
-        </w:rPr>
-        <w:t>10</w:t>
-      </w:r>
-      <w:r>
-        <w:t>。ボス戦などの重大な局面を除き、通常のエンカウント戦闘は極めて短い時間（場合によっては数秒から一瞬）で決着がつくように設計されている</w:t>
-      </w:r>
-      <w:r>
-        <w:rPr>
-          <w:vertAlign w:val="superscript"/>
-        </w:rPr>
-        <w:t>10</w:t>
-      </w:r>
-      <w:r>
-        <w:t>。</w:t>
-      </w:r>
-    </w:p>
-    <w:p>
-      <w:r>
-        <w:t>この高速化を支えているのが、テキストログによるフィードバックシステムである。過度なアニメーションの待機時間を最小限に抑え、猛烈なスピードでテキストログが流れ、ステータスが変動していく様子が視覚化される</w:t>
-      </w:r>
-      <w:r>
-        <w:rPr>
-          <w:vertAlign w:val="superscript"/>
-        </w:rPr>
-        <w:t>11</w:t>
-      </w:r>
-      <w:r>
-        <w:t>。これにより、プレイヤーは「圧倒的な速度で敵を粉砕し、自らのパラメーターがインフレーションしていく」という全能感（トランス状態）に浸ることができる。また、一部のシステムにおいては、プレイヤーの任意で</w:t>
-      </w:r>
-      <w:r>
-        <w:lastRenderedPageBreak/>
-        <w:t>戦闘のテンポ（テンション）を上げることができるが、これは自身の攻撃力が上がるわけではなく、純粋に「ダメージを受ける速度」も上がる仕様となっている</w:t>
-      </w:r>
-      <w:r>
-        <w:rPr>
-          <w:vertAlign w:val="superscript"/>
-        </w:rPr>
-        <w:t>11</w:t>
-      </w:r>
-      <w:r>
-        <w:t>。安易な高速化は死に直結するという、絶妙なリスク・リターンの罠が戦闘システム自体に組み込まれているのである。</w:t>
-      </w:r>
-    </w:p>
-    <w:p>
-      <w:pPr>
-        <w:rPr>
-          <w:b/>
-          <w:bCs/>
-        </w:rPr>
-      </w:pPr>
-      <w:r>
-        <w:rPr>
-          <w:b/>
-          <w:bCs/>
-        </w:rPr>
-        <w:t>2.2 空間的リスク管理としての「スタックシステム」</w:t>
-      </w:r>
-    </w:p>
-    <w:p>
-      <w:r>
-        <w:t>『ライヂング☆スター』シリーズなどで採用されている戦闘システムは、エンカウントの概念を空間的かつ戦略的に再構築している。一般的なRPGのように敵に触れると即座に戦闘画面に移行するのではなく、フィールド上の敵に触れた「方向」に敵がストック（蓄積）されていくという独特のメカニクスが存在する</w:t>
-      </w:r>
-      <w:r>
-        <w:rPr>
-          <w:vertAlign w:val="superscript"/>
-        </w:rPr>
-        <w:t>10</w:t>
-      </w:r>
-      <w:r>
-        <w:t>。</w:t>
-      </w:r>
-    </w:p>
-    <w:p>
-      <w:r>
-        <w:t>プレイヤーは、ストックされた複数の敵と一括して戦闘を行うことができる。大量の敵を一度に処理すれば、経験値やアイテム収集の効率は劇的に跳ね上がる。しかし、プレイヤー自身の処理能力（現在のステータスや装備ビルド）を超えた数を溜め込みすぎると、戦闘開始と同時に瞬く間にゲームオーバーとなる</w:t>
-      </w:r>
-      <w:r>
-        <w:rPr>
-          <w:vertAlign w:val="superscript"/>
-        </w:rPr>
-        <w:t>10</w:t>
-      </w:r>
-      <w:r>
-        <w:t>。このシステムは、プレイヤーに対して「現在の自分のビルドで、何匹までなら同時に捌けるか」というチキンレースを常に強要する。これにより、単調になりがちなザコ敵との戦闘作業が、能動的なリスク管理と限界への挑戦という高度なゲームプレイへと昇華されている。</w:t>
-      </w:r>
-    </w:p>
-    <w:p>
-      <w:pPr>
-        <w:rPr>
-          <w:b/>
-          <w:bCs/>
-        </w:rPr>
-      </w:pPr>
-      <w:r>
-        <w:rPr>
-          <w:b/>
-          <w:bCs/>
-        </w:rPr>
-        <w:t>2.3 リソースの連続性：移動と戦闘のトレードオフ</w:t>
-      </w:r>
-    </w:p>
-    <w:p>
-      <w:r>
-        <w:t>マップの探索行動そのものに戦略的リソースを絡ませる手法も、アンディーメンテ作品における際立った特徴である。歩数をベースとしたパラメーター振り分け型の探索システムが採用されることが多く、マップを「歩く」こと自体が探索、戦闘、アイテム収集のトリガーとなる</w:t>
-      </w:r>
-      <w:r>
-        <w:rPr>
-          <w:vertAlign w:val="superscript"/>
-        </w:rPr>
-        <w:t>6</w:t>
-      </w:r>
-      <w:r>
-        <w:t>。</w:t>
-      </w:r>
-    </w:p>
-    <w:p>
-      <w:r>
-        <w:t>ここで重要になるのが、移動時のスタミナ（SP）と戦闘時のスキルポイント（SP）の連続性である。実際のゲーム展開において、移動用のSPと戦闘用のSPは別システムとして機能しているものの、戦闘突入時には「移動時のSPを半分だけ持ち込める」といった強烈な制約が課される仕様が存在する</w:t>
-      </w:r>
-      <w:r>
-        <w:rPr>
-          <w:vertAlign w:val="superscript"/>
-        </w:rPr>
-        <w:t>10</w:t>
-      </w:r>
-      <w:r>
-        <w:t>。このメカニクスにより、「強力なアイテムを取るために遠回りをして移動SPを消費するか」、それとも「万全のSPを保って特殊攻撃を連発するために最短ルートでボスに挑むか」という、探索と戦闘の間に深刻な駆け引き（トレードオフ）が生じる</w:t>
-      </w:r>
-      <w:r>
-        <w:rPr>
-          <w:vertAlign w:val="superscript"/>
-        </w:rPr>
-        <w:t>10</w:t>
-      </w:r>
-      <w:r>
-        <w:t>。プレイヤーは常にマップの踏破ルートを最適化するパズルを解くことを求められる。</w:t>
-      </w:r>
-    </w:p>
-    <w:p>
-      <w:r>
-        <w:t>さらに、『アポロガル・エピソード』や『混沌のルーシー』に見られるように、タクティクスバトルやカード収集要素を取り入れたリアルタイムバトルなど、作品ごとに戦闘のインターフェースは変化するが、根底にある「リソースの最適化」と「システム構築による効率化」という哲学は一貫している</w:t>
-      </w:r>
-      <w:r>
-        <w:rPr>
-          <w:vertAlign w:val="superscript"/>
-        </w:rPr>
-        <w:t>3</w:t>
       </w:r>
       <w:r>
         <w:t>。</w:t>
@@ -317,42 +245,33 @@
                 <w:b/>
                 <w:bCs/>
               </w:rPr>
-              <w:t>戦闘メカニクスの</w:t>
-            </w:r>
+              <w:t>戦闘メカニクスの構成要素</w:t>
+            </w:r>
+          </w:p>
+        </w:tc>
+        <w:tc>
+          <w:tcPr>
+            <w:tcW w:w="0" w:type="auto"/>
+            <w:tcBorders>
+              <w:top w:val="single" w:sz="6" w:space="0" w:color="C4C7C5"/>
+              <w:left w:val="single" w:sz="6" w:space="0" w:color="C4C7C5"/>
+              <w:bottom w:val="single" w:sz="6" w:space="0" w:color="C4C7C5"/>
+              <w:right w:val="single" w:sz="6" w:space="0" w:color="C4C7C5"/>
+            </w:tcBorders>
+            <w:tcMar>
+              <w:top w:w="120" w:type="dxa"/>
+              <w:left w:w="180" w:type="dxa"/>
+              <w:bottom w:w="120" w:type="dxa"/>
+              <w:right w:w="180" w:type="dxa"/>
+            </w:tcMar>
+            <w:hideMark/>
+          </w:tcPr>
+          <w:p>
             <w:r>
               <w:rPr>
                 <w:b/>
                 <w:bCs/>
               </w:rPr>
-              <w:lastRenderedPageBreak/>
-              <w:t>構成要素</w:t>
-            </w:r>
-          </w:p>
-        </w:tc>
-        <w:tc>
-          <w:tcPr>
-            <w:tcW w:w="0" w:type="auto"/>
-            <w:tcBorders>
-              <w:top w:val="single" w:sz="6" w:space="0" w:color="C4C7C5"/>
-              <w:left w:val="single" w:sz="6" w:space="0" w:color="C4C7C5"/>
-              <w:bottom w:val="single" w:sz="6" w:space="0" w:color="C4C7C5"/>
-              <w:right w:val="single" w:sz="6" w:space="0" w:color="C4C7C5"/>
-            </w:tcBorders>
-            <w:tcMar>
-              <w:top w:w="120" w:type="dxa"/>
-              <w:left w:w="180" w:type="dxa"/>
-              <w:bottom w:w="120" w:type="dxa"/>
-              <w:right w:w="180" w:type="dxa"/>
-            </w:tcMar>
-            <w:hideMark/>
-          </w:tcPr>
-          <w:p>
-            <w:r>
-              <w:rPr>
-                <w:b/>
-                <w:bCs/>
-              </w:rPr>
-              <w:lastRenderedPageBreak/>
               <w:t>実装仕様の概要</w:t>
             </w:r>
           </w:p>
@@ -634,53 +553,53 @@
                 <w:b/>
                 <w:bCs/>
               </w:rPr>
-              <w:t>属性・系統分類</w:t>
-            </w:r>
-          </w:p>
-        </w:tc>
-        <w:tc>
-          <w:tcPr>
-            <w:tcW w:w="0" w:type="auto"/>
-            <w:tcBorders>
-              <w:top w:val="single" w:sz="6" w:space="0" w:color="C4C7C5"/>
-              <w:left w:val="single" w:sz="6" w:space="0" w:color="C4C7C5"/>
-              <w:bottom w:val="single" w:sz="6" w:space="0" w:color="C4C7C5"/>
-              <w:right w:val="single" w:sz="6" w:space="0" w:color="C4C7C5"/>
-            </w:tcBorders>
-            <w:tcMar>
-              <w:top w:w="120" w:type="dxa"/>
-              <w:left w:w="180" w:type="dxa"/>
-              <w:bottom w:w="120" w:type="dxa"/>
-              <w:right w:w="180" w:type="dxa"/>
-            </w:tcMar>
-            <w:hideMark/>
-          </w:tcPr>
-          <w:p>
-            <w:r>
-              <w:t>敵を「邪霊」「鳥族」などに分類し、外見的特徴から弱点属性を推測可能なデータベースを構築する。</w:t>
-            </w:r>
-          </w:p>
-        </w:tc>
-        <w:tc>
-          <w:tcPr>
-            <w:tcW w:w="0" w:type="auto"/>
-            <w:tcBorders>
-              <w:top w:val="single" w:sz="6" w:space="0" w:color="C4C7C5"/>
-              <w:left w:val="single" w:sz="6" w:space="0" w:color="C4C7C5"/>
-              <w:bottom w:val="single" w:sz="6" w:space="0" w:color="C4C7C5"/>
-              <w:right w:val="single" w:sz="6" w:space="0" w:color="C4C7C5"/>
-            </w:tcBorders>
-            <w:tcMar>
-              <w:top w:w="120" w:type="dxa"/>
-              <w:left w:w="180" w:type="dxa"/>
-              <w:bottom w:w="120" w:type="dxa"/>
-              <w:right w:w="180" w:type="dxa"/>
-            </w:tcMar>
-            <w:hideMark/>
-          </w:tcPr>
-          <w:p>
-            <w:r>
-              <w:t>知識の蓄積によるメタプログレッション。事前準備とビルド変更による圧倒的優位性の獲得。</w:t>
+              <w:t>ノンフィールド選択型進行</w:t>
+            </w:r>
+          </w:p>
+        </w:tc>
+        <w:tc>
+          <w:tcPr>
+            <w:tcW w:w="0" w:type="auto"/>
+            <w:tcBorders>
+              <w:top w:val="single" w:sz="6" w:space="0" w:color="C4C7C5"/>
+              <w:left w:val="single" w:sz="6" w:space="0" w:color="C4C7C5"/>
+              <w:bottom w:val="single" w:sz="6" w:space="0" w:color="C4C7C5"/>
+              <w:right w:val="single" w:sz="6" w:space="0" w:color="C4C7C5"/>
+            </w:tcBorders>
+            <w:tcMar>
+              <w:top w:w="120" w:type="dxa"/>
+              <w:left w:w="180" w:type="dxa"/>
+              <w:bottom w:w="120" w:type="dxa"/>
+              <w:right w:w="180" w:type="dxa"/>
+            </w:tcMar>
+            <w:hideMark/>
+          </w:tcPr>
+          <w:p>
+            <w:r>
+              <w:t>マップ移動を排除し、「進む」「戦う」などの純粋なテキストコマンド選択のみでダンジョンを進行させる。</w:t>
+            </w:r>
+          </w:p>
+        </w:tc>
+        <w:tc>
+          <w:tcPr>
+            <w:tcW w:w="0" w:type="auto"/>
+            <w:tcBorders>
+              <w:top w:val="single" w:sz="6" w:space="0" w:color="C4C7C5"/>
+              <w:left w:val="single" w:sz="6" w:space="0" w:color="C4C7C5"/>
+              <w:bottom w:val="single" w:sz="6" w:space="0" w:color="C4C7C5"/>
+              <w:right w:val="single" w:sz="6" w:space="0" w:color="C4C7C5"/>
+            </w:tcBorders>
+            <w:tcMar>
+              <w:top w:w="120" w:type="dxa"/>
+              <w:left w:w="180" w:type="dxa"/>
+              <w:bottom w:w="120" w:type="dxa"/>
+              <w:right w:w="180" w:type="dxa"/>
+            </w:tcMar>
+            <w:hideMark/>
+          </w:tcPr>
+          <w:p>
+            <w:r>
+              <w:t>ローグライク的な緊張感の極大化。極限まで削ぎ落とされたUIによる意思決定の連続。</w:t>
             </w:r>
           </w:p>
         </w:tc>
@@ -703,176 +622,166 @@
     </w:p>
     <w:p>
       <w:r>
-        <w:t>アンディーメンテのハクスラにおける最大の求心力は、「システムの中にうごめく壮大なデータの渦」にプレイヤー自身がダイブし、圧倒的なパラメーターのインフレーションを楽しむ点にある</w:t>
+        <w:t>アンディーメンテのハクスラにおける最大の求心力は、「システムの中にうごめく壮大なデータの渦」にプレイヤー自身がダイブし、圧倒的なパラメーターのインフレーションを楽しむ点にある。このインフレーションは単なる数字の増加ではなく、複数のパラメーターが複雑に絡み合うことで、無数のビルド構築を可能にしている。</w:t>
+      </w:r>
+    </w:p>
+    <w:p>
+      <w:pPr>
+        <w:rPr>
+          <w:b/>
+          <w:bCs/>
+        </w:rPr>
+      </w:pPr>
+      <w:r>
+        <w:rPr>
+          <w:b/>
+          <w:bCs/>
+        </w:rPr>
+        <w:t>3.1 複合的ステータスと相乗効果（シナジー）</w:t>
+      </w:r>
+    </w:p>
+    <w:p>
+      <w:r>
+        <w:t>単純な「攻撃力」「防御力」という一次元的な設計を避け、各ステータスが複数の役割を担うことで、プレイヤーに深いビルド構築の悩みを提示している。例えば、ダメージを上昇させるベースステータスとして、物理攻撃は「Strength（攻撃）」、弓などの遠隔攻撃は「Range」、魔法攻撃は「Magic（知力）」が独立して存在する。ここで特筆すべきは、RangeとMagicはそれぞれの威力を上げるだけでなく、「命中率」の向上にも寄与する点である。</w:t>
+      </w:r>
+    </w:p>
+    <w:p>
+      <w:r>
+        <w:lastRenderedPageBreak/>
+        <w:t>さらに防御面においては、物理ダメージを減らす「防御」とは別に、魔法ダメージを減らすための「精神」パラメーターが存在する。この「精神」パラメーターは、単なる魔法防御力にとどまらず、プレイヤー自身が使用する「バフ（強化魔法）や回復魔法の効果」も同時に強化する仕様となっている。これにより、「魔法の被弾を抑えるためのタンク役」が、同時に「強力なヒーラー・バッファー」を兼ねるという、論理的かつ独創的なビルドが成立する。バフ効果は重ねがけが可能に設計されていることが多く、時間をかけてパラメーターを増幅させれば、本来は勝てない格上の敵にも対抗できるという戦術の広がりをもたらしている。</w:t>
+      </w:r>
+    </w:p>
+    <w:p>
+      <w:pPr>
+        <w:rPr>
+          <w:b/>
+          <w:bCs/>
+        </w:rPr>
+      </w:pPr>
+      <w:r>
+        <w:rPr>
+          <w:b/>
+          <w:bCs/>
+        </w:rPr>
+        <w:t>3.2 装備更新によるパラメーターの爆発的跳躍</w:t>
+      </w:r>
+    </w:p>
+    <w:p>
+      <w:r>
+        <w:t>ハクスラゲームにおいて「ドロップアイテムを獲得する喜び」を最大化するため、装備品のステータス依存度が極めて高く設計されている。一般的なRPGがキャラクターのレベルアップによる基礎ステータスの上昇を主軸とするのに対し、アンディーメンテのシステムでは、新しい武器や防具に更新した際のダメージの伸び幅がカタログスペックを遥かに凌駕する。</w:t>
+      </w:r>
+    </w:p>
+    <w:p>
+      <w:r>
+        <w:t>エンチャントやレアリティの高い装備を獲得し、それを装備した瞬間に、主人公の火力が4倍から10倍へと跳ね上がり、これまで苦戦していた敵の群れをワンクリックで全滅させられるようになるほどの劇的なパワーバランスの変動が用意されている。この「圧倒的な武力を手に入れた」という強烈な成功体験が、ハクスラ本来の「より強いレア装備を求めてダンジョンに潜り続ける」というモチベーションを永続的にドライブさせる。</w:t>
+      </w:r>
+    </w:p>
+    <w:p>
+      <w:pPr>
+        <w:rPr>
+          <w:b/>
+          <w:bCs/>
+        </w:rPr>
+      </w:pPr>
+      <w:r>
+        <w:rPr>
+          <w:b/>
+          <w:bCs/>
+        </w:rPr>
+        <w:t>3.3 アビリティフリーセットとメダル（着脱式）システム</w:t>
+      </w:r>
+    </w:p>
+    <w:p>
+      <w:r>
+        <w:t>多種多様なジョブ（クラス）をマスターし、そこで得たアビリティ（技）を自由に組み合わせるシステムが育成の根幹にある。固定の職業概念に縛られることなく、プレイヤーはアビリティをパズルのように組み替えて最強のシナジー（コンボ）を発見していく。</w:t>
+      </w:r>
+    </w:p>
+    <w:p>
+      <w:r>
+        <w:t>さらに『混沌のルーシー』などの作品では、アビリティとは別に「神メダル」のような着脱可能なパッシブ強化パーツの概念が存在する</w:t>
       </w:r>
       <w:r>
         <w:rPr>
           <w:vertAlign w:val="superscript"/>
         </w:rPr>
-        <w:t>6</w:t>
-      </w:r>
-      <w:r>
-        <w:t>。このインフレーションは単なる数字の増加ではなく、複数のパラメーターが複雑に絡み合うことで、無数のビルド構築を可能にしている。</w:t>
-      </w:r>
-    </w:p>
-    <w:p>
-      <w:pPr>
-        <w:rPr>
-          <w:b/>
-          <w:bCs/>
-        </w:rPr>
-      </w:pPr>
-      <w:r>
-        <w:rPr>
-          <w:b/>
-          <w:bCs/>
-        </w:rPr>
-        <w:t>3.1 複合的ステータスと相乗効果（シナジー）</w:t>
-      </w:r>
-    </w:p>
-    <w:p>
-      <w:r>
-        <w:t>単純な「攻撃力」「防御力」という一次元的な設計を避け、各ステータスが複数の役割を担うことで、プレイヤーに深いビルド構築の悩みを提示している。例えば、ダメージを上昇させるベースステータスとして、物理攻撃は「Strength（攻撃）」、弓などの遠隔攻撃は「Range」、魔法攻撃は「Magic（知力）」が独立して存在する</w:t>
+        <w:t>3</w:t>
+      </w:r>
+      <w:r>
+        <w:t>。これらは単純に装備できるわけではなく、「AP（アクションポイント等のコスト）」の上限や「装備枠の制限」といった制約の範囲内でやり繰りする必要がある</w:t>
       </w:r>
       <w:r>
         <w:rPr>
           <w:vertAlign w:val="superscript"/>
         </w:rPr>
-        <w:t>8</w:t>
-      </w:r>
-      <w:r>
-        <w:t>。ここで特筆すべきは、RangeとMagicはそれぞれの威力を上げるだけでなく、「命中率」の向上にも寄与する点である</w:t>
+        <w:t>3</w:t>
+      </w:r>
+      <w:r>
+        <w:t>。限られたコストの中でどの能力を捨て、どの能力を伸ばすかというリソースパズルが、ビルド構築の奥深さをさらに一段引き上げている</w:t>
       </w:r>
       <w:r>
         <w:rPr>
           <w:vertAlign w:val="superscript"/>
         </w:rPr>
-        <w:t>8</w:t>
+        <w:t>3</w:t>
       </w:r>
       <w:r>
         <w:t>。</w:t>
       </w:r>
     </w:p>
     <w:p>
-      <w:r>
-        <w:t>さらに防御面においては、物理ダメージを減らす「防御」とは別に、魔法ダメージを減らすための「精神」パラメーターが存在する。この「精神」パラメーターは、単なる魔法防御力にとどまらず、プレイヤー自身が使用する「バフ（強化魔法）や回復魔法の効果」も</w:t>
-      </w:r>
-      <w:r>
-        <w:lastRenderedPageBreak/>
-        <w:t>同時に強化する仕様となっている</w:t>
+      <w:pPr>
+        <w:rPr>
+          <w:b/>
+          <w:bCs/>
+        </w:rPr>
+      </w:pPr>
+      <w:r>
+        <w:rPr>
+          <w:b/>
+          <w:bCs/>
+        </w:rPr>
+        <w:t>3.4 カード（ブック）構築とリアルタイム性の融合</w:t>
+      </w:r>
+    </w:p>
+    <w:p>
+      <w:r>
+        <w:t>同じく『混沌のルーシー』などにみられる特徴として、ハクスラ要素に「カードゲーム（デッキ構築）」のメカニクスを融合させたシステムがある</w:t>
       </w:r>
       <w:r>
         <w:rPr>
           <w:vertAlign w:val="superscript"/>
         </w:rPr>
-        <w:t>15</w:t>
-      </w:r>
-      <w:r>
-        <w:t>。これにより、「魔法の被弾を抑えるためのタンク役」が、同時に「強力なヒーラー・バッファー」を兼ねるという、論理的かつ独創的なビルドが成立する。バフ効果は重ねがけが可能に設計されていることが多く、時間をかけてパラメーターを増幅させれば、本来は勝てない格上の敵にも対抗できるという戦術の広がりをもたらしている</w:t>
+        <w:t>4</w:t>
+      </w:r>
+      <w:r>
+        <w:t>。 敵を倒してドロップした膨大な種類のカードを収集し、自分だけの「ブック（デッキ）」を構築する</w:t>
       </w:r>
       <w:r>
         <w:rPr>
           <w:vertAlign w:val="superscript"/>
         </w:rPr>
-        <w:t>15</w:t>
+        <w:t>4</w:t>
+      </w:r>
+      <w:r>
+        <w:t>。そして戦闘はターン制のカードゲームではなく、リアルタイムバトルの中で手札を回して戦うという複合的なシステムとなっている</w:t>
+      </w:r>
+      <w:r>
+        <w:rPr>
+          <w:vertAlign w:val="superscript"/>
+        </w:rPr>
+        <w:t>4</w:t>
+      </w:r>
+      <w:r>
+        <w:t>。事前の緻密なデッキ構築（ビルド）と、戦闘中の瞬時の判断（アクション性・ランダム性）が融合することで、独自の中毒性を生み出している</w:t>
+      </w:r>
+      <w:r>
+        <w:rPr>
+          <w:vertAlign w:val="superscript"/>
+        </w:rPr>
+        <w:t>4</w:t>
       </w:r>
       <w:r>
         <w:t>。</w:t>
-      </w:r>
-    </w:p>
-    <w:p>
-      <w:pPr>
-        <w:rPr>
-          <w:b/>
-          <w:bCs/>
-        </w:rPr>
-      </w:pPr>
-      <w:r>
-        <w:rPr>
-          <w:b/>
-          <w:bCs/>
-        </w:rPr>
-        <w:t>3.2 装備更新によるパラメーターの爆発的跳躍</w:t>
-      </w:r>
-    </w:p>
-    <w:p>
-      <w:r>
-        <w:t>ハクスラゲームにおいて「ドロップアイテムを獲得する喜び」を最大化するため、装備品のステータス依存度が極めて高く設計されている。一般的なRPGがキャラクターのレベルアップによる基礎ステータスの上昇を主軸とするのに対し、アンディーメンテのシステムでは、新しい武器や防具に更新した際のダメージの伸び幅がカタログスペックを遥かに凌駕する</w:t>
-      </w:r>
-      <w:r>
-        <w:rPr>
-          <w:vertAlign w:val="superscript"/>
-        </w:rPr>
-        <w:t>8</w:t>
-      </w:r>
-      <w:r>
-        <w:t>。</w:t>
-      </w:r>
-    </w:p>
-    <w:p>
-      <w:r>
-        <w:t>エンチャントやレアリティの高い装備を獲得し、それを装備した瞬間に、主人公の火力が4倍から10倍へと跳ね上がり、これまで苦戦していた敵の群れをワンクリックで全滅させられるようになるほどの劇的なパワーバランスの変動が用意されている</w:t>
-      </w:r>
-      <w:r>
-        <w:rPr>
-          <w:vertAlign w:val="superscript"/>
-        </w:rPr>
-        <w:t>8</w:t>
-      </w:r>
-      <w:r>
-        <w:t>。この「圧倒的な武力を手に入れた」という強烈な成功体験が、ハクスラ本来の「より強いレア装備を求めてダンジョンに潜り続ける」というモチベーションを永続的にドライブさせる。</w:t>
-      </w:r>
-    </w:p>
-    <w:p>
-      <w:r>
-        <w:t>また、強力な装備を入手する手段として、ドロップだけでなく「製作系スキル」への投資も用意されており、戦闘を極めるルートと生産を極めるルートという、プレイスタイルに応じた複数の成長ベクトルが担保されている</w:t>
-      </w:r>
-      <w:r>
-        <w:rPr>
-          <w:vertAlign w:val="superscript"/>
-        </w:rPr>
-        <w:t>8</w:t>
-      </w:r>
-      <w:r>
-        <w:t>。</w:t>
-      </w:r>
-    </w:p>
-    <w:p>
-      <w:pPr>
-        <w:rPr>
-          <w:b/>
-          <w:bCs/>
-        </w:rPr>
-      </w:pPr>
-      <w:r>
-        <w:rPr>
-          <w:b/>
-          <w:bCs/>
-        </w:rPr>
-        <w:t>3.3 ジョブシステムとアビリティの組み合わせによるパズル</w:t>
-      </w:r>
-    </w:p>
-    <w:p>
-      <w:r>
-        <w:t>『アールエス』や『ライヂング☆スター』シリーズに見られるように、多種多様なジョブ（クラス）をマスターし、そこで得たアビリティ（技）を自由に組み合わせるシステムが育成の根幹にある</w:t>
-      </w:r>
-      <w:r>
-        <w:rPr>
-          <w:vertAlign w:val="superscript"/>
-        </w:rPr>
-        <w:t>3</w:t>
-      </w:r>
-      <w:r>
-        <w:t>。固定の職業概念に縛られることなく、戦士の技と魔法使いのスキルを混在させることができる。プレイヤーは「歩く」ことで探索し、敵と戦い、少しずつレベルを上げて装備を整える中で、アビリティをパズルのように組み替えて最強のシナジー（コンボ）を発見していく</w:t>
-      </w:r>
-      <w:r>
-        <w:rPr>
-          <w:vertAlign w:val="superscript"/>
-        </w:rPr>
-        <w:t>13</w:t>
-      </w:r>
-      <w:r>
-        <w:t>。この「システムの裏を突くような組み合わせ」をプレイヤー自身に見つけさせることこそが、ゲームデザインの主眼となっている。</w:t>
       </w:r>
     </w:p>
     <w:tbl>
@@ -887,9 +796,9 @@
         <w:tblLook w:val="04A0" w:firstRow="1" w:lastRow="0" w:firstColumn="1" w:lastColumn="0" w:noHBand="0" w:noVBand="1"/>
       </w:tblPr>
       <w:tblGrid>
-        <w:gridCol w:w="1438"/>
-        <w:gridCol w:w="3634"/>
-        <w:gridCol w:w="3416"/>
+        <w:gridCol w:w="1390"/>
+        <w:gridCol w:w="3656"/>
+        <w:gridCol w:w="3442"/>
       </w:tblGrid>
       <w:tr>
         <w:tc>
@@ -915,6 +824,7 @@
                 <w:b/>
                 <w:bCs/>
               </w:rPr>
+              <w:lastRenderedPageBreak/>
               <w:t>ステータス・育成要素</w:t>
             </w:r>
           </w:p>
@@ -1073,7 +983,6 @@
                 <w:b/>
                 <w:bCs/>
               </w:rPr>
-              <w:lastRenderedPageBreak/>
               <w:t>精神 (Spirit) 統合</w:t>
             </w:r>
           </w:p>
@@ -1121,81 +1030,6 @@
           <w:p>
             <w:r>
               <w:t>防御特化キャラクターが自動的に優秀なサポーターとなることで、死にステータスを排除した効率的なビルドを形成する。</w:t>
-            </w:r>
-          </w:p>
-        </w:tc>
-      </w:tr>
-      <w:tr>
-        <w:tc>
-          <w:tcPr>
-            <w:tcW w:w="0" w:type="auto"/>
-            <w:tcBorders>
-              <w:top w:val="single" w:sz="6" w:space="0" w:color="C4C7C5"/>
-              <w:left w:val="single" w:sz="6" w:space="0" w:color="C4C7C5"/>
-              <w:bottom w:val="single" w:sz="6" w:space="0" w:color="C4C7C5"/>
-              <w:right w:val="single" w:sz="6" w:space="0" w:color="C4C7C5"/>
-            </w:tcBorders>
-            <w:tcMar>
-              <w:top w:w="120" w:type="dxa"/>
-              <w:left w:w="180" w:type="dxa"/>
-              <w:bottom w:w="120" w:type="dxa"/>
-              <w:right w:w="180" w:type="dxa"/>
-            </w:tcMar>
-            <w:hideMark/>
-          </w:tcPr>
-          <w:p>
-            <w:r>
-              <w:rPr>
-                <w:b/>
-                <w:bCs/>
-              </w:rPr>
-              <w:t>バフの重複（スタック）</w:t>
-            </w:r>
-          </w:p>
-        </w:tc>
-        <w:tc>
-          <w:tcPr>
-            <w:tcW w:w="0" w:type="auto"/>
-            <w:tcBorders>
-              <w:top w:val="single" w:sz="6" w:space="0" w:color="C4C7C5"/>
-              <w:left w:val="single" w:sz="6" w:space="0" w:color="C4C7C5"/>
-              <w:bottom w:val="single" w:sz="6" w:space="0" w:color="C4C7C5"/>
-              <w:right w:val="single" w:sz="6" w:space="0" w:color="C4C7C5"/>
-            </w:tcBorders>
-            <w:tcMar>
-              <w:top w:w="120" w:type="dxa"/>
-              <w:left w:w="180" w:type="dxa"/>
-              <w:bottom w:w="120" w:type="dxa"/>
-              <w:right w:w="180" w:type="dxa"/>
-            </w:tcMar>
-            <w:hideMark/>
-          </w:tcPr>
-          <w:p>
-            <w:r>
-              <w:t>同一の強化魔法・スキルの複数回使用による効果の蓄積（上限設定あり、または緩い）。</w:t>
-            </w:r>
-          </w:p>
-        </w:tc>
-        <w:tc>
-          <w:tcPr>
-            <w:tcW w:w="0" w:type="auto"/>
-            <w:tcBorders>
-              <w:top w:val="single" w:sz="6" w:space="0" w:color="C4C7C5"/>
-              <w:left w:val="single" w:sz="6" w:space="0" w:color="C4C7C5"/>
-              <w:bottom w:val="single" w:sz="6" w:space="0" w:color="C4C7C5"/>
-              <w:right w:val="single" w:sz="6" w:space="0" w:color="C4C7C5"/>
-            </w:tcBorders>
-            <w:tcMar>
-              <w:top w:w="120" w:type="dxa"/>
-              <w:left w:w="180" w:type="dxa"/>
-              <w:bottom w:w="120" w:type="dxa"/>
-              <w:right w:w="180" w:type="dxa"/>
-            </w:tcMar>
-            <w:hideMark/>
-          </w:tcPr>
-          <w:p>
-            <w:r>
-              <w:t>格上のボスに対する「戦闘前準備の徹底」という解法を提供し、アクション性よりも戦術性を優位に立たせる。</w:t>
             </w:r>
           </w:p>
         </w:tc>
@@ -1299,53 +1133,128 @@
                 <w:b/>
                 <w:bCs/>
               </w:rPr>
-              <w:t>アビリティフリーセット</w:t>
-            </w:r>
-          </w:p>
-        </w:tc>
-        <w:tc>
-          <w:tcPr>
-            <w:tcW w:w="0" w:type="auto"/>
-            <w:tcBorders>
-              <w:top w:val="single" w:sz="6" w:space="0" w:color="C4C7C5"/>
-              <w:left w:val="single" w:sz="6" w:space="0" w:color="C4C7C5"/>
-              <w:bottom w:val="single" w:sz="6" w:space="0" w:color="C4C7C5"/>
-              <w:right w:val="single" w:sz="6" w:space="0" w:color="C4C7C5"/>
-            </w:tcBorders>
-            <w:tcMar>
-              <w:top w:w="120" w:type="dxa"/>
-              <w:left w:w="180" w:type="dxa"/>
-              <w:bottom w:w="120" w:type="dxa"/>
-              <w:right w:w="180" w:type="dxa"/>
-            </w:tcMar>
-            <w:hideMark/>
-          </w:tcPr>
-          <w:p>
-            <w:r>
-              <w:t>習得したジョブ・クラスのアビリティをコスト制限内で自由に付け替え可能なパレットシステム。</w:t>
-            </w:r>
-          </w:p>
-        </w:tc>
-        <w:tc>
-          <w:tcPr>
-            <w:tcW w:w="0" w:type="auto"/>
-            <w:tcBorders>
-              <w:top w:val="single" w:sz="6" w:space="0" w:color="C4C7C5"/>
-              <w:left w:val="single" w:sz="6" w:space="0" w:color="C4C7C5"/>
-              <w:bottom w:val="single" w:sz="6" w:space="0" w:color="C4C7C5"/>
-              <w:right w:val="single" w:sz="6" w:space="0" w:color="C4C7C5"/>
-            </w:tcBorders>
-            <w:tcMar>
-              <w:top w:w="120" w:type="dxa"/>
-              <w:left w:w="180" w:type="dxa"/>
-              <w:bottom w:w="120" w:type="dxa"/>
-              <w:right w:w="180" w:type="dxa"/>
-            </w:tcMar>
-            <w:hideMark/>
-          </w:tcPr>
-          <w:p>
-            <w:r>
-              <w:t>メタゲーム的な最適解の探求。プレイヤーによる自発的なシステム破壊（圧倒的シナジーの発見）を許容する。</w:t>
+              <w:t>制限付きメダル装備</w:t>
+            </w:r>
+          </w:p>
+        </w:tc>
+        <w:tc>
+          <w:tcPr>
+            <w:tcW w:w="0" w:type="auto"/>
+            <w:tcBorders>
+              <w:top w:val="single" w:sz="6" w:space="0" w:color="C4C7C5"/>
+              <w:left w:val="single" w:sz="6" w:space="0" w:color="C4C7C5"/>
+              <w:bottom w:val="single" w:sz="6" w:space="0" w:color="C4C7C5"/>
+              <w:right w:val="single" w:sz="6" w:space="0" w:color="C4C7C5"/>
+            </w:tcBorders>
+            <w:tcMar>
+              <w:top w:w="120" w:type="dxa"/>
+              <w:left w:w="180" w:type="dxa"/>
+              <w:bottom w:w="120" w:type="dxa"/>
+              <w:right w:w="180" w:type="dxa"/>
+            </w:tcMar>
+            <w:hideMark/>
+          </w:tcPr>
+          <w:p>
+            <w:r>
+              <w:t>効果の高い着脱式アイテム（メダル等）を、全体AP（コスト）や枠数の上限内でやり繰りしてセットする。</w:t>
+            </w:r>
+          </w:p>
+        </w:tc>
+        <w:tc>
+          <w:tcPr>
+            <w:tcW w:w="0" w:type="auto"/>
+            <w:tcBorders>
+              <w:top w:val="single" w:sz="6" w:space="0" w:color="C4C7C5"/>
+              <w:left w:val="single" w:sz="6" w:space="0" w:color="C4C7C5"/>
+              <w:bottom w:val="single" w:sz="6" w:space="0" w:color="C4C7C5"/>
+              <w:right w:val="single" w:sz="6" w:space="0" w:color="C4C7C5"/>
+            </w:tcBorders>
+            <w:tcMar>
+              <w:top w:w="120" w:type="dxa"/>
+              <w:left w:w="180" w:type="dxa"/>
+              <w:bottom w:w="120" w:type="dxa"/>
+              <w:right w:w="180" w:type="dxa"/>
+            </w:tcMar>
+            <w:hideMark/>
+          </w:tcPr>
+          <w:p>
+            <w:r>
+              <w:t>アビリティとは別軸での制約下パズル。プレイスタイルに応じた微細なチューニングを可能にする。</w:t>
+            </w:r>
+          </w:p>
+        </w:tc>
+      </w:tr>
+      <w:tr>
+        <w:tc>
+          <w:tcPr>
+            <w:tcW w:w="0" w:type="auto"/>
+            <w:tcBorders>
+              <w:top w:val="single" w:sz="6" w:space="0" w:color="C4C7C5"/>
+              <w:left w:val="single" w:sz="6" w:space="0" w:color="C4C7C5"/>
+              <w:bottom w:val="single" w:sz="6" w:space="0" w:color="C4C7C5"/>
+              <w:right w:val="single" w:sz="6" w:space="0" w:color="C4C7C5"/>
+            </w:tcBorders>
+            <w:tcMar>
+              <w:top w:w="120" w:type="dxa"/>
+              <w:left w:w="180" w:type="dxa"/>
+              <w:bottom w:w="120" w:type="dxa"/>
+              <w:right w:w="180" w:type="dxa"/>
+            </w:tcMar>
+            <w:hideMark/>
+          </w:tcPr>
+          <w:p>
+            <w:r>
+              <w:rPr>
+                <w:b/>
+                <w:bCs/>
+              </w:rPr>
+              <w:t>カードデッキ構築</w:t>
+            </w:r>
+          </w:p>
+        </w:tc>
+        <w:tc>
+          <w:tcPr>
+            <w:tcW w:w="0" w:type="auto"/>
+            <w:tcBorders>
+              <w:top w:val="single" w:sz="6" w:space="0" w:color="C4C7C5"/>
+              <w:left w:val="single" w:sz="6" w:space="0" w:color="C4C7C5"/>
+              <w:bottom w:val="single" w:sz="6" w:space="0" w:color="C4C7C5"/>
+              <w:right w:val="single" w:sz="6" w:space="0" w:color="C4C7C5"/>
+            </w:tcBorders>
+            <w:tcMar>
+              <w:top w:w="120" w:type="dxa"/>
+              <w:left w:w="180" w:type="dxa"/>
+              <w:bottom w:w="120" w:type="dxa"/>
+              <w:right w:w="180" w:type="dxa"/>
+            </w:tcMar>
+            <w:hideMark/>
+          </w:tcPr>
+          <w:p>
+            <w:r>
+              <w:t>収集した膨大なスキル/アイテムカードから「ブック（デッキ）」を組み、リアルタイム戦闘で運用する。</w:t>
+            </w:r>
+          </w:p>
+        </w:tc>
+        <w:tc>
+          <w:tcPr>
+            <w:tcW w:w="0" w:type="auto"/>
+            <w:tcBorders>
+              <w:top w:val="single" w:sz="6" w:space="0" w:color="C4C7C5"/>
+              <w:left w:val="single" w:sz="6" w:space="0" w:color="C4C7C5"/>
+              <w:bottom w:val="single" w:sz="6" w:space="0" w:color="C4C7C5"/>
+              <w:right w:val="single" w:sz="6" w:space="0" w:color="C4C7C5"/>
+            </w:tcBorders>
+            <w:tcMar>
+              <w:top w:w="120" w:type="dxa"/>
+              <w:left w:w="180" w:type="dxa"/>
+              <w:bottom w:w="120" w:type="dxa"/>
+              <w:right w:w="180" w:type="dxa"/>
+            </w:tcMar>
+            <w:hideMark/>
+          </w:tcPr>
+          <w:p>
+            <w:r>
+              <w:t>事前の構築戦略と、戦闘中のランダム性（手札の引き）およびアクション性の融合。</w:t>
             </w:r>
           </w:p>
         </w:tc>
@@ -1388,66 +1297,13 @@
     </w:p>
     <w:p>
       <w:r>
-        <w:t>『ぢきゅうぢそく』『きみの島』、『ワールドエンドダイナー』等に見られるように、単に敵と戦うだけでなく「生きるためのリソース」を管理するシステムが深く組み込まれている</w:t>
-      </w:r>
-      <w:r>
-        <w:rPr>
-          <w:vertAlign w:val="superscript"/>
-        </w:rPr>
-        <w:t>2</w:t>
-      </w:r>
-      <w:r>
-        <w:t>。</w:t>
-      </w:r>
-    </w:p>
-    <w:p>
-      <w:r>
-        <w:t>これらのゲームでは、行動するごとに時間が経過し、それに伴って「体力」「空腹」「渇き」などの生存パラメーターが減少していく</w:t>
-      </w:r>
-      <w:r>
-        <w:rPr>
-          <w:vertAlign w:val="superscript"/>
-        </w:rPr>
-        <w:t>9</w:t>
-      </w:r>
-      <w:r>
-        <w:t>。空腹状態になると行動効率が劇的に落ち、最悪の場合は行動不能に陥るため、プレイヤーは常にタイムマネジメントを強いられる</w:t>
-      </w:r>
-      <w:r>
-        <w:rPr>
-          <w:vertAlign w:val="superscript"/>
-        </w:rPr>
-        <w:t>12</w:t>
-      </w:r>
-      <w:r>
-        <w:t>。空腹を満たすためには、魚を釣る、木の実を採集する、あるいは小麦を栽培してパンを焼くといったスローライフ的な行動が必須となる</w:t>
-      </w:r>
-      <w:r>
-        <w:rPr>
-          <w:vertAlign w:val="superscript"/>
-        </w:rPr>
-        <w:t>9</w:t>
-      </w:r>
-      <w:r>
-        <w:t>。</w:t>
-      </w:r>
-    </w:p>
-    <w:p>
-      <w:r>
-        <w:t>これらのシミュレーション的な「準備」は、独立したミニゲームではなく、モンスターの襲撃から村や拠点を守るためのRPG戦闘に直結している</w:t>
-      </w:r>
-      <w:r>
-        <w:rPr>
-          <w:vertAlign w:val="superscript"/>
-        </w:rPr>
-        <w:t>9</w:t>
-      </w:r>
-      <w:r>
-        <w:t>。戦闘で得た素材を使って施設を拡張し、自給自足の基盤を強化することで、より過酷なダンジョンでのハクスラが可能</w:t>
-      </w:r>
+        <w:t>『ぢきゅうぢそく』『きみの島』、『ワールドエンドダイナー』等に見られるように、単に敵と戦うだけでなく「生きるためのリソース」を管理するシステムが深く組み込まれている。</w:t>
+      </w:r>
+    </w:p>
+    <w:p>
       <w:r>
         <w:lastRenderedPageBreak/>
-        <w:t>になるという、強力なマクロの循環ループが形成されているのである。</w:t>
+        <w:t>これらのゲームでは、行動するごとに時間が経過し、それに伴って「体力」「空腹」「渇き」などの生存パラメーターが減少していく。空腹状態になると行動効率が劇的に落ち、最悪の場合は行動不能に陥るため、プレイヤーは常にタイムマネジメントを強いられる。空腹を満たすためには、魚を釣る、木の実を採集する、あるいは小麦を栽培してパンを焼くといったスローライフ的な行動が必須となる。これらのシミュレーション的な「準備」は、独立したミニゲームではなく、モンスターの襲撃から村や拠点を守るためのRPG戦闘に直結している。</w:t>
       </w:r>
     </w:p>
     <w:p>
@@ -1467,48 +1323,12 @@
     </w:p>
     <w:p>
       <w:r>
-        <w:t>ハクスラは往々にして疲労を伴うが、アンディーメンテのシステムは「プレイヤーのペース配分」をシステム側が全肯定する作りになっている。例えば、店舗経営や村落管理を行うゲームにおいて、「一日の半分をアイテムのクラフトや開店準備（内政）に充て、残り半分をダンジョン探索（営業・戦闘）に充てる」といったプレイスタイルが完全に自由化されている</w:t>
-      </w:r>
-      <w:r>
-        <w:rPr>
-          <w:vertAlign w:val="superscript"/>
-        </w:rPr>
-        <w:t>8</w:t>
-      </w:r>
-      <w:r>
-        <w:t>。ゲーム側から強迫的なタスクリストが提示されることは少なく、「プレイヤーがゆっくりしようと思えば好きなだけゆっくり進む」ことが可能である</w:t>
-      </w:r>
-      <w:r>
-        <w:rPr>
-          <w:vertAlign w:val="superscript"/>
-        </w:rPr>
-        <w:t>8</w:t>
-      </w:r>
-      <w:r>
-        <w:t>。</w:t>
-      </w:r>
-    </w:p>
-    <w:p>
-      <w:r>
-        <w:t>さらに特筆すべきは、クラフト要素や経営要素の「バイパス（回避）機能」がシステムとして内包されている点である。近年のクラフトゲームにありがちな「素材の素材の素材を集める」といった過剰な多段レイヤーを避け、料理やクラフトのほとんどは1〜2段階で完結する</w:t>
-      </w:r>
-      <w:r>
-        <w:rPr>
-          <w:vertAlign w:val="superscript"/>
-        </w:rPr>
-        <w:t>8</w:t>
-      </w:r>
-      <w:r>
-        <w:t>。それでもクラフトや採集が面倒なハクスラ純粋主義者のためには、ゲーム内で稼いだ通貨を用いて「店売りアイテム」や「完成済みの設備」を徴収できる選択肢が多数用意されている</w:t>
-      </w:r>
-      <w:r>
-        <w:rPr>
-          <w:vertAlign w:val="superscript"/>
-        </w:rPr>
-        <w:t>8</w:t>
-      </w:r>
-      <w:r>
-        <w:t>。これにより、シミュレーション要素が「やらされる作業」ではなく、あくまで「プレイヤーが選択可能な拡張コンテンツ」として機能し、プレイスタイルの多様性を担保している。</w:t>
+        <w:t>ハクスラは往々にして疲労を伴うが、アンディーメンテのシステムは「プレイヤーのペース配分」をシステム側が全肯定する作りになっている。店舗経営や村落管理を行うゲームにおいて、「一日の半分をアイテムのクラフトや開店準備（内政）に充て、残り半分をダンジョン探索（営業・戦闘）に充てる」といったプレイスタイルが完全に自由化されている。</w:t>
+      </w:r>
+    </w:p>
+    <w:p>
+      <w:r>
+        <w:t>さらに特筆すべきは、クラフト要素や経営要素の「バイパス（回避）機能」がシステムとして内包されている点である。近年のクラフトゲームにありがちな「素材の素材の素材を集める」といった過剰な多段レイヤーを避け、料理やクラフトのほとんどは1〜2段階で完結する。それでもクラフトや採集が面倒なハクスラ純粋主義者のためには、ゲーム内で稼いだ通貨を用いて「店売りアイテム」や「完成済みの設備」を徴収できる選択肢が多数用意されている。これにより、シミュレーション要素が「やらされる作業」ではなく、あくまで「プレイヤーが選択可能な拡張コンテンツ」として機能している。</w:t>
       </w:r>
     </w:p>
     <w:p>
@@ -1528,25 +1348,7 @@
     </w:p>
     <w:p>
       <w:r>
-        <w:t>一方で、『ウトナと3人の騎士』に代表される王国復興シミュレーションなどでは、非常にシビアなマクロ管理が要求される。突然の災害が頻発し、内政値が下がり、名声が地に落ち、人口が減少し、国が常に滅亡への道を辿るという絶望的な状況下でのプレイとなる</w:t>
-      </w:r>
-      <w:r>
-        <w:rPr>
-          <w:vertAlign w:val="superscript"/>
-        </w:rPr>
-        <w:t>3</w:t>
-      </w:r>
-      <w:r>
-        <w:t>。しかし、王（主人公）の命が尽きない限りゲームオーバーにはならないというシステムにより、プレイヤーは「崩壊していく組織の中で、いかに個人の武力と戦術で抗うか」という独特のカタルシスを味わうことができる</w:t>
-      </w:r>
-      <w:r>
-        <w:rPr>
-          <w:vertAlign w:val="superscript"/>
-        </w:rPr>
-        <w:t>11</w:t>
-      </w:r>
-      <w:r>
-        <w:t>。</w:t>
+        <w:t>一方で、王国復興シミュレーションなどでは、非常にシビアなマクロ管理が要求される。突然の災害が頻発し、内政値が下がり、名声が地に落ち、人口が減少し、国が常に滅亡への道を辿るという絶望的な状況下でのプレイとなる。しかし、王（主人公）の命が尽きない限りゲームオーバーにはならないというシステムにより、プレイヤーは「崩壊していく組織の中で、いかに個人の武力と戦術で抗うか」という独特のカタルシスを味わうことができる。</w:t>
       </w:r>
     </w:p>
     <w:tbl>
@@ -1747,6 +1549,7 @@
                 <w:b/>
                 <w:bCs/>
               </w:rPr>
+              <w:lastRenderedPageBreak/>
               <w:t>浅層クラフトシステム</w:t>
             </w:r>
           </w:p>
@@ -1822,7 +1625,6 @@
                 <w:b/>
                 <w:bCs/>
               </w:rPr>
-              <w:lastRenderedPageBreak/>
               <w:t>経済的バイパス（回避）</w:t>
             </w:r>
           </w:p>
@@ -2062,45 +1864,110 @@
     </w:p>
     <w:p>
       <w:r>
-        <w:t>ゲーム開始直後、プレイヤーは意図的に「何がどうなっているか分からない」膨大なデータや専門用語の渦に放り込まれる</w:t>
+        <w:t>ゲーム開始直後、プレイヤーは意図的に「何がどうなっているか分からない」膨大なデータや専門用語の渦に放り込まれる。現代のゲームにありがちな、プレイヤーの手を取って全てを教える丁寧すぎる動線（チュートリアル）はあえて用意されていないことが多い。</w:t>
+      </w:r>
+    </w:p>
+    <w:p>
+      <w:r>
+        <w:t>その代わり、プレイヤー自身が「歩く」「戦う」「死ぬ」という行動を繰り返すことを通じて、システムの法則性を解読していく過程そのものがゲーム化されている。敵の弱点系統、パラメーターの因果関係、隠し要素の発見など、情報は一気に開示されるのではなく、プレイヤーの進行に合わせて段階的に、あるいは非連続的に小出しにされる。これにより、プレイヤーは脳内で情報を補完し、謎を結合していくパズル的な喜びを得る。システムを完全に理解し、「データの渦」を支配下に置いた時の達成感は、用意されたストーリーをクリアする以上の圧倒的な快感となる。</w:t>
+      </w:r>
+    </w:p>
+    <w:p>
+      <w:pPr>
+        <w:rPr>
+          <w:b/>
+          <w:bCs/>
+        </w:rPr>
+      </w:pPr>
+      <w:r>
+        <w:rPr>
+          <w:b/>
+          <w:bCs/>
+        </w:rPr>
+        <w:t>5.2 「WWA的」ルート構築とUndo機能</w:t>
+      </w:r>
+    </w:p>
+    <w:p>
+      <w:r>
+        <w:t xml:space="preserve">探索のシステムにおいて、複数セーブ分けや「Undo（やり直し）」機能が実装されているタイトルも存在する。これは、古典的なブラウザゲーム『WWA（World Wide </w:t>
+      </w:r>
+      <w:r>
+        <w:lastRenderedPageBreak/>
+        <w:t>Adventure）』のような、リソース管理とルート取りの最適化パズルとしての側面を強調している。</w:t>
+      </w:r>
+    </w:p>
+    <w:p>
+      <w:r>
+        <w:t>一歩間違えれば即死する状況下で、無限にルート取りを考え、最適なリソース消費を計算するという、極めて論理的なゲームプレイが可能になる。システムが死をペナルティとして重く扱うのではなく、試行錯誤のためのフィードバックとして機能させているのである。</w:t>
+      </w:r>
+    </w:p>
+    <w:p>
+      <w:pPr>
+        <w:rPr>
+          <w:b/>
+          <w:bCs/>
+        </w:rPr>
+      </w:pPr>
+      <w:r>
+        <w:rPr>
+          <w:b/>
+          <w:bCs/>
+        </w:rPr>
+        <w:t>5.3 独特なテキストセンスと暗鬱な世界観のギャップ</w:t>
+      </w:r>
+    </w:p>
+    <w:p>
+      <w:r>
+        <w:t>システムと不可分なのが、ゲーム内のテキスト表現である。敵キャラクター名、アイテム名、スキル名、さらにはシステム上のメッセージに至るまで、常軌を逸した独特のネーミングセンス（シュール、あるいはギャグ調）が散りばめられている。</w:t>
+      </w:r>
+    </w:p>
+    <w:p>
+      <w:r>
+        <w:t>しかし、表面上はギャグやシュールなテキストで彩られているにもかかわらず、その根底にあるストーリー展開や世界設定は非常に重く、退廃的（ダークワールド）であったり、シリアスなSF、あるいは過去の英雄の挫折を描く悲劇であったりする。この「ふざけたUIやネーミング」と「絶望的な世界観」のギャップが、単純なパラメーター上げゲームに深い感情移入をもたらしている。</w:t>
+      </w:r>
+    </w:p>
+    <w:p>
+      <w:pPr>
+        <w:rPr>
+          <w:b/>
+          <w:bCs/>
+        </w:rPr>
+      </w:pPr>
+      <w:r>
+        <w:rPr>
+          <w:b/>
+          <w:bCs/>
+        </w:rPr>
+        <w:t>5.4 狂気を帯びたミニゲーム群と自己制約の美学</w:t>
+      </w:r>
+    </w:p>
+    <w:p>
+      <w:r>
+        <w:t>本編のゲームループとは別に、あるいは生活要素の一環として、『米とぎ婆の魚釣り』に見られるような「魚に銃を撃ち込みながら釣り上げる」といった常軌を逸したミニゲームが用意されていることがある</w:t>
       </w:r>
       <w:r>
         <w:rPr>
           <w:vertAlign w:val="superscript"/>
         </w:rPr>
-        <w:t>6</w:t>
-      </w:r>
-      <w:r>
-        <w:t>。現代のゲームにありがちな、プレイヤーの手を取って全てを教える丁寧すぎる動線（チュートリアル）はあえて用意されていないことが多い。</w:t>
-      </w:r>
-    </w:p>
-    <w:p>
-      <w:r>
-        <w:t>その代わり、プレイヤー自身が「歩く」「戦う」「死ぬ」という行動を繰り返すことを通じて、システムの法則性を解読していく過程そのものがゲーム化されている</w:t>
+        <w:t>5</w:t>
+      </w:r>
+      <w:r>
+        <w:t>。 これらのミニゲームは単なる息抜きにとどまらず、釣具やリールの細かいレベルアップ要素が設けられており、それ自体が独立したハクスラとして機能している</w:t>
       </w:r>
       <w:r>
         <w:rPr>
           <w:vertAlign w:val="superscript"/>
         </w:rPr>
-        <w:t>6</w:t>
-      </w:r>
-      <w:r>
-        <w:t>。敵の弱点系統、パラメーターの因果関係、隠し要素の発見など、情報は一気に開示されるのではなく、プレイヤーの進行に合わせて段階的に、あるいは非連続的に小出しにされる</w:t>
+        <w:t>5</w:t>
+      </w:r>
+      <w:r>
+        <w:t>。さらに、ゲームを極めたプレイヤーに対しては「釣った魚には餌をあげない」「名前は2バイトまで」といった特有の自己制約（縛りルール）でのプレイを推奨するような風土があり、メタなやり込み要素として昇華されている</w:t>
       </w:r>
       <w:r>
         <w:rPr>
           <w:vertAlign w:val="superscript"/>
         </w:rPr>
-        <w:t>11</w:t>
-      </w:r>
-      <w:r>
-        <w:t>。これにより、プレイヤーは脳内で情報を補完し、謎を結合していくパズル的な喜びを得る。システムを完全に理解し、「データの渦」を支配下に置いた時の達成感は、用意されたストーリーをクリアする以上の圧倒的な快感となる</w:t>
-      </w:r>
-      <w:r>
-        <w:rPr>
-          <w:vertAlign w:val="superscript"/>
-        </w:rPr>
-        <w:t>6</w:t>
+        <w:t>5</w:t>
       </w:r>
       <w:r>
         <w:t>。</w:t>
@@ -2118,124 +1985,12 @@
           <w:b/>
           <w:bCs/>
         </w:rPr>
-        <w:t>5.2 「WWA的」ルート構築とUndo機能</w:t>
-      </w:r>
-    </w:p>
-    <w:p>
-      <w:r>
-        <w:t>探索のシステムにおいて、複数セーブ分けや「Undo（やり直し）」機能が実装されているタイトルも存在する</w:t>
-      </w:r>
-      <w:r>
-        <w:rPr>
-          <w:vertAlign w:val="superscript"/>
-        </w:rPr>
-        <w:t>8</w:t>
-      </w:r>
-      <w:r>
-        <w:t>。これは、古典的なブラウザゲーム『WWA（World Wide Adventure）』のような、リソース管理とルート取りの最適化パズルとしての側面を強調している。 最初はその独特のUIやシステムに戸惑うかもしれないが、慣れれば「一歩間違えれば即死する状況下で、無限にルート取りを考え、最適なリソース消費を計算する」という、極めて論理的なゲームプレイが可能になる</w:t>
-      </w:r>
-      <w:r>
-        <w:rPr>
-          <w:vertAlign w:val="superscript"/>
-        </w:rPr>
-        <w:t>8</w:t>
-      </w:r>
-      <w:r>
-        <w:t>。システムが死をペナルティとして重く</w:t>
-      </w:r>
-      <w:r>
-        <w:lastRenderedPageBreak/>
-        <w:t>扱うのではなく、試行錯誤のためのフィードバックとして機能させているのである。</w:t>
-      </w:r>
-    </w:p>
-    <w:p>
-      <w:pPr>
-        <w:rPr>
-          <w:b/>
-          <w:bCs/>
-        </w:rPr>
-      </w:pPr>
-      <w:r>
-        <w:rPr>
-          <w:b/>
-          <w:bCs/>
-        </w:rPr>
-        <w:t>5.3 独特なテキストセンスと暗鬱な世界観のギャップ</w:t>
-      </w:r>
-    </w:p>
-    <w:p>
-      <w:r>
-        <w:t>システムと不可分なのが、ゲーム内のテキスト表現である。敵キャラクター名、アイテム名、スキル名、さらにはシステム上のメッセージに至るまで、常軌を逸した独特のネーミングセンス（シュール、あるいはギャグ調）が散りばめられている</w:t>
-      </w:r>
-      <w:r>
-        <w:rPr>
-          <w:vertAlign w:val="superscript"/>
-        </w:rPr>
-        <w:t>17</w:t>
-      </w:r>
-      <w:r>
-        <w:t>。これにより、「ただの攻撃力アップのバフスキル」が、プレイヤーの記憶に強く刻み込まれる固有の体験となる。</w:t>
-      </w:r>
-    </w:p>
-    <w:p>
-      <w:r>
-        <w:t>しかし、表面上はギャグやシュールなテキストで彩られているにもかかわらず、その根底にあるストーリー展開や世界設定は非常に重く、退廃的（ダークワールド）であったり、シリアスなSF、あるいは過去の英雄の挫折を描く悲劇であったりする</w:t>
-      </w:r>
-      <w:r>
-        <w:rPr>
-          <w:vertAlign w:val="superscript"/>
-        </w:rPr>
-        <w:t>11</w:t>
-      </w:r>
-      <w:r>
-        <w:t>。幸せとは何かを問うような甘さのない展開、暗躍する組織、謎が謎を呼ぶスパイラルなど、プレイヤーを深く物語に引き込むストーリーテリングが存在する</w:t>
-      </w:r>
-      <w:r>
-        <w:rPr>
-          <w:vertAlign w:val="superscript"/>
-        </w:rPr>
-        <w:t>11</w:t>
-      </w:r>
-      <w:r>
-        <w:t>。この「ふざけたUIやネーミング」と「絶望的な世界観」のギャップが、単純なパラメーター上げゲームに深い感情移入をもたらしている。</w:t>
-      </w:r>
-    </w:p>
-    <w:p>
-      <w:pPr>
-        <w:rPr>
-          <w:b/>
-          <w:bCs/>
-        </w:rPr>
-      </w:pPr>
-      <w:r>
-        <w:rPr>
-          <w:b/>
-          <w:bCs/>
-        </w:rPr>
-        <w:t>5.4 緩く繋がる非同期オンラインシステム</w:t>
-      </w:r>
-    </w:p>
-    <w:p>
-      <w:r>
-        <w:t>シングルプレイのハクスラでありながら、独特のネットワークシステムを介して他者と関わる仕組みが構築されているタイトル（『シーツリー』や『その炭鉱の名は』など）がある</w:t>
-      </w:r>
-      <w:r>
-        <w:rPr>
-          <w:vertAlign w:val="superscript"/>
-        </w:rPr>
-        <w:t>3</w:t>
-      </w:r>
-      <w:r>
-        <w:t>。 これは、MMORPGほどの拘束力や同調圧力を完全に排除し、他プレイヤーの死亡ログ、残したメッセージ、売買したアイテムの流通など、システムを介してのみ他者を感じる「非同期通信（緩い繋がり）」である</w:t>
-      </w:r>
-      <w:r>
-        <w:rPr>
-          <w:vertAlign w:val="superscript"/>
-        </w:rPr>
-        <w:t>3</w:t>
-      </w:r>
-      <w:r>
-        <w:t>。このシステムは、孤独なハクスラ作業に「他者への顕示」や「緩やかな競争・共闘感」というスパイスを加え、シングルプレイの没入感を損なうことなく、長期的なプレイのモチベーションを維持する機能として働いている。</w:t>
+        <w:t>5.5 緩く繋がる非同期オンラインシステム</w:t>
+      </w:r>
+    </w:p>
+    <w:p>
+      <w:r>
+        <w:t>シングルプレイのハクスラでありながら、独特のネットワークシステムを介して他者と関わる仕組みが構築されているタイトルがある。これは、MMORPGほどの拘束力や同調圧力を完全に排除し、他プレイヤーの死亡ログ、残したメッセージ、売買したアイテムの流通など、システムを介してのみ他者を感じる「非同期通信（緩い繋がり）」である。このシステムは、孤独なハクスラ作業に「他者への顕示」や「緩やかな競争・共闘感」というスパイスを加えている。</w:t>
       </w:r>
     </w:p>
     <w:p>
@@ -2255,7 +2010,7 @@
     </w:p>
     <w:p>
       <w:r>
-        <w:t>以上の詳細な分析に基づき、AIプロンプトやゲーム仕様書の策定にそのまま活用できる「アンディーメンテ的ハクスラゲーム」のシステム要件定義フレームワークを以下の表に体系化する。AIに対して「以下の要件に従い、ゲームの企画書/コアメカニクス設計を出力せよ」と指示することで、特有のプレイフィールを高い精度で再現できる。</w:t>
+        <w:t>以上の詳細な分析に基づき、AIプロンプトやゲーム仕様書の策定にそのまま活用できる「アンディーメンテ的ハクスラゲーム」のシステム要件定義フレームワークを以下の表に体系化する。</w:t>
       </w:r>
     </w:p>
     <w:tbl>
@@ -2270,9 +2025,9 @@
         <w:tblLook w:val="04A0" w:firstRow="1" w:lastRow="0" w:firstColumn="1" w:lastColumn="0" w:noHBand="0" w:noVBand="1"/>
       </w:tblPr>
       <w:tblGrid>
-        <w:gridCol w:w="1276"/>
-        <w:gridCol w:w="3907"/>
-        <w:gridCol w:w="3305"/>
+        <w:gridCol w:w="1262"/>
+        <w:gridCol w:w="4012"/>
+        <w:gridCol w:w="3214"/>
       </w:tblGrid>
       <w:tr>
         <w:tc>
@@ -2325,138 +2080,7 @@
                 <w:b/>
                 <w:bCs/>
               </w:rPr>
-              <w:t>プロンプトに記述すべき実装仕様（システム要件）</w:t>
-            </w:r>
-          </w:p>
-        </w:tc>
-        <w:tc>
-          <w:tcPr>
-            <w:tcW w:w="0" w:type="auto"/>
-            <w:tcBorders>
-              <w:top w:val="single" w:sz="6" w:space="0" w:color="C4C7C5"/>
-              <w:left w:val="single" w:sz="6" w:space="0" w:color="C4C7C5"/>
-              <w:bottom w:val="single" w:sz="6" w:space="0" w:color="C4C7C5"/>
-              <w:right w:val="single" w:sz="6" w:space="0" w:color="C4C7C5"/>
-            </w:tcBorders>
-            <w:tcMar>
-              <w:top w:w="120" w:type="dxa"/>
-              <w:left w:w="180" w:type="dxa"/>
-              <w:bottom w:w="120" w:type="dxa"/>
-              <w:right w:w="180" w:type="dxa"/>
-            </w:tcMar>
-            <w:hideMark/>
-          </w:tcPr>
-          <w:p>
-            <w:r>
-              <w:rPr>
-                <w:b/>
-                <w:bCs/>
-              </w:rPr>
-              <w:t>意図するゲームデザイン的効果</w:t>
-            </w:r>
-          </w:p>
-        </w:tc>
-      </w:tr>
-      <w:tr>
-        <w:tc>
-          <w:tcPr>
-            <w:tcW w:w="0" w:type="auto"/>
-            <w:tcBorders>
-              <w:top w:val="single" w:sz="6" w:space="0" w:color="C4C7C5"/>
-              <w:left w:val="single" w:sz="6" w:space="0" w:color="C4C7C5"/>
-              <w:bottom w:val="single" w:sz="6" w:space="0" w:color="C4C7C5"/>
-              <w:right w:val="single" w:sz="6" w:space="0" w:color="C4C7C5"/>
-            </w:tcBorders>
-            <w:tcMar>
-              <w:top w:w="120" w:type="dxa"/>
-              <w:left w:w="180" w:type="dxa"/>
-              <w:bottom w:w="120" w:type="dxa"/>
-              <w:right w:w="180" w:type="dxa"/>
-            </w:tcMar>
-            <w:hideMark/>
-          </w:tcPr>
-          <w:p>
-            <w:r>
-              <w:rPr>
-                <w:b/>
-                <w:bCs/>
-              </w:rPr>
-              <w:t>進行・テンポ</w:t>
-            </w:r>
-          </w:p>
-        </w:tc>
-        <w:tc>
-          <w:tcPr>
-            <w:tcW w:w="0" w:type="auto"/>
-            <w:tcBorders>
-              <w:top w:val="single" w:sz="6" w:space="0" w:color="C4C7C5"/>
-              <w:left w:val="single" w:sz="6" w:space="0" w:color="C4C7C5"/>
-              <w:bottom w:val="single" w:sz="6" w:space="0" w:color="C4C7C5"/>
-              <w:right w:val="single" w:sz="6" w:space="0" w:color="C4C7C5"/>
-            </w:tcBorders>
-            <w:tcMar>
-              <w:top w:w="120" w:type="dxa"/>
-              <w:left w:w="180" w:type="dxa"/>
-              <w:bottom w:w="120" w:type="dxa"/>
-              <w:right w:w="180" w:type="dxa"/>
-            </w:tcMar>
-            <w:hideMark/>
-          </w:tcPr>
-          <w:p>
-            <w:r>
-              <w:t>アニメーションを最小化し、数秒で決着がつく戦闘と、テキストログの高速スクロールによるインフレ表現を実装する。</w:t>
-            </w:r>
-          </w:p>
-        </w:tc>
-        <w:tc>
-          <w:tcPr>
-            <w:tcW w:w="0" w:type="auto"/>
-            <w:tcBorders>
-              <w:top w:val="single" w:sz="6" w:space="0" w:color="C4C7C5"/>
-              <w:left w:val="single" w:sz="6" w:space="0" w:color="C4C7C5"/>
-              <w:bottom w:val="single" w:sz="6" w:space="0" w:color="C4C7C5"/>
-              <w:right w:val="single" w:sz="6" w:space="0" w:color="C4C7C5"/>
-            </w:tcBorders>
-            <w:tcMar>
-              <w:top w:w="120" w:type="dxa"/>
-              <w:left w:w="180" w:type="dxa"/>
-              <w:bottom w:w="120" w:type="dxa"/>
-              <w:right w:w="180" w:type="dxa"/>
-            </w:tcMar>
-            <w:hideMark/>
-          </w:tcPr>
-          <w:p>
-            <w:r>
-              <w:t>作業感の排除。圧倒的スピードで数字が膨れ上がる「計算論的トランス状態」の提供。</w:t>
-            </w:r>
-          </w:p>
-        </w:tc>
-      </w:tr>
-      <w:tr>
-        <w:tc>
-          <w:tcPr>
-            <w:tcW w:w="0" w:type="auto"/>
-            <w:tcBorders>
-              <w:top w:val="single" w:sz="6" w:space="0" w:color="C4C7C5"/>
-              <w:left w:val="single" w:sz="6" w:space="0" w:color="C4C7C5"/>
-              <w:bottom w:val="single" w:sz="6" w:space="0" w:color="C4C7C5"/>
-              <w:right w:val="single" w:sz="6" w:space="0" w:color="C4C7C5"/>
-            </w:tcBorders>
-            <w:tcMar>
-              <w:top w:w="120" w:type="dxa"/>
-              <w:left w:w="180" w:type="dxa"/>
-              <w:bottom w:w="120" w:type="dxa"/>
-              <w:right w:w="180" w:type="dxa"/>
-            </w:tcMar>
-            <w:hideMark/>
-          </w:tcPr>
-          <w:p>
-            <w:r>
-              <w:rPr>
-                <w:b/>
-                <w:bCs/>
-              </w:rPr>
-              <w:t>エンカウ</w:t>
+              <w:t>プロンプトに記述すべき実装仕様（シ</w:t>
             </w:r>
             <w:r>
               <w:rPr>
@@ -2464,68 +2088,10 @@
                 <w:bCs/>
               </w:rPr>
               <w:lastRenderedPageBreak/>
-              <w:t>ント</w:t>
-            </w:r>
-          </w:p>
-        </w:tc>
-        <w:tc>
-          <w:tcPr>
-            <w:tcW w:w="0" w:type="auto"/>
-            <w:tcBorders>
-              <w:top w:val="single" w:sz="6" w:space="0" w:color="C4C7C5"/>
-              <w:left w:val="single" w:sz="6" w:space="0" w:color="C4C7C5"/>
-              <w:bottom w:val="single" w:sz="6" w:space="0" w:color="C4C7C5"/>
-              <w:right w:val="single" w:sz="6" w:space="0" w:color="C4C7C5"/>
-            </w:tcBorders>
-            <w:tcMar>
-              <w:top w:w="120" w:type="dxa"/>
-              <w:left w:w="180" w:type="dxa"/>
-              <w:bottom w:w="120" w:type="dxa"/>
-              <w:right w:w="180" w:type="dxa"/>
-            </w:tcMar>
-            <w:hideMark/>
-          </w:tcPr>
-          <w:p>
-            <w:r>
-              <w:lastRenderedPageBreak/>
-              <w:t>敵に接触した方向の敵を「ストッ</w:t>
-            </w:r>
-            <w:r>
-              <w:lastRenderedPageBreak/>
-              <w:t>ク」し、任意のタイミングで一括戦闘を行えるシステム（まとめ狩り）を導入する。</w:t>
-            </w:r>
-          </w:p>
-        </w:tc>
-        <w:tc>
-          <w:tcPr>
-            <w:tcW w:w="0" w:type="auto"/>
-            <w:tcBorders>
-              <w:top w:val="single" w:sz="6" w:space="0" w:color="C4C7C5"/>
-              <w:left w:val="single" w:sz="6" w:space="0" w:color="C4C7C5"/>
-              <w:bottom w:val="single" w:sz="6" w:space="0" w:color="C4C7C5"/>
-              <w:right w:val="single" w:sz="6" w:space="0" w:color="C4C7C5"/>
-            </w:tcBorders>
-            <w:tcMar>
-              <w:top w:w="120" w:type="dxa"/>
-              <w:left w:w="180" w:type="dxa"/>
-              <w:bottom w:w="120" w:type="dxa"/>
-              <w:right w:w="180" w:type="dxa"/>
-            </w:tcMar>
-            <w:hideMark/>
-          </w:tcPr>
-          <w:p>
-            <w:r>
-              <w:lastRenderedPageBreak/>
-              <w:t>効率化の誘惑と、全滅リスクの</w:t>
-            </w:r>
-            <w:r>
-              <w:lastRenderedPageBreak/>
-              <w:t>チキンレースを恒常的に発生させる。</w:t>
-            </w:r>
-          </w:p>
-        </w:tc>
-      </w:tr>
-      <w:tr>
+              <w:t>ステム要件）</w:t>
+            </w:r>
+          </w:p>
+        </w:tc>
         <w:tc>
           <w:tcPr>
             <w:tcW w:w="0" w:type="auto"/>
@@ -2550,6 +2116,269 @@
                 <w:bCs/>
               </w:rPr>
               <w:lastRenderedPageBreak/>
+              <w:t>意図するゲームデザイン的効</w:t>
+            </w:r>
+            <w:r>
+              <w:rPr>
+                <w:b/>
+                <w:bCs/>
+              </w:rPr>
+              <w:lastRenderedPageBreak/>
+              <w:t>果</w:t>
+            </w:r>
+          </w:p>
+        </w:tc>
+      </w:tr>
+      <w:tr>
+        <w:tc>
+          <w:tcPr>
+            <w:tcW w:w="0" w:type="auto"/>
+            <w:tcBorders>
+              <w:top w:val="single" w:sz="6" w:space="0" w:color="C4C7C5"/>
+              <w:left w:val="single" w:sz="6" w:space="0" w:color="C4C7C5"/>
+              <w:bottom w:val="single" w:sz="6" w:space="0" w:color="C4C7C5"/>
+              <w:right w:val="single" w:sz="6" w:space="0" w:color="C4C7C5"/>
+            </w:tcBorders>
+            <w:tcMar>
+              <w:top w:w="120" w:type="dxa"/>
+              <w:left w:w="180" w:type="dxa"/>
+              <w:bottom w:w="120" w:type="dxa"/>
+              <w:right w:w="180" w:type="dxa"/>
+            </w:tcMar>
+            <w:hideMark/>
+          </w:tcPr>
+          <w:p>
+            <w:r>
+              <w:rPr>
+                <w:b/>
+                <w:bCs/>
+              </w:rPr>
+              <w:lastRenderedPageBreak/>
+              <w:t>進行・テンポ</w:t>
+            </w:r>
+          </w:p>
+        </w:tc>
+        <w:tc>
+          <w:tcPr>
+            <w:tcW w:w="0" w:type="auto"/>
+            <w:tcBorders>
+              <w:top w:val="single" w:sz="6" w:space="0" w:color="C4C7C5"/>
+              <w:left w:val="single" w:sz="6" w:space="0" w:color="C4C7C5"/>
+              <w:bottom w:val="single" w:sz="6" w:space="0" w:color="C4C7C5"/>
+              <w:right w:val="single" w:sz="6" w:space="0" w:color="C4C7C5"/>
+            </w:tcBorders>
+            <w:tcMar>
+              <w:top w:w="120" w:type="dxa"/>
+              <w:left w:w="180" w:type="dxa"/>
+              <w:bottom w:w="120" w:type="dxa"/>
+              <w:right w:w="180" w:type="dxa"/>
+            </w:tcMar>
+            <w:hideMark/>
+          </w:tcPr>
+          <w:p>
+            <w:r>
+              <w:t>アニメーションを最小化し、数秒で決着がつく戦闘と、テキストログの高速スクロールによるインフレ表現を実装する。</w:t>
+            </w:r>
+          </w:p>
+        </w:tc>
+        <w:tc>
+          <w:tcPr>
+            <w:tcW w:w="0" w:type="auto"/>
+            <w:tcBorders>
+              <w:top w:val="single" w:sz="6" w:space="0" w:color="C4C7C5"/>
+              <w:left w:val="single" w:sz="6" w:space="0" w:color="C4C7C5"/>
+              <w:bottom w:val="single" w:sz="6" w:space="0" w:color="C4C7C5"/>
+              <w:right w:val="single" w:sz="6" w:space="0" w:color="C4C7C5"/>
+            </w:tcBorders>
+            <w:tcMar>
+              <w:top w:w="120" w:type="dxa"/>
+              <w:left w:w="180" w:type="dxa"/>
+              <w:bottom w:w="120" w:type="dxa"/>
+              <w:right w:w="180" w:type="dxa"/>
+            </w:tcMar>
+            <w:hideMark/>
+          </w:tcPr>
+          <w:p>
+            <w:r>
+              <w:t>作業感の排除。圧倒的スピードで数字が膨れ上がる「計算論的トランス状態」の提供。</w:t>
+            </w:r>
+          </w:p>
+        </w:tc>
+      </w:tr>
+      <w:tr>
+        <w:tc>
+          <w:tcPr>
+            <w:tcW w:w="0" w:type="auto"/>
+            <w:tcBorders>
+              <w:top w:val="single" w:sz="6" w:space="0" w:color="C4C7C5"/>
+              <w:left w:val="single" w:sz="6" w:space="0" w:color="C4C7C5"/>
+              <w:bottom w:val="single" w:sz="6" w:space="0" w:color="C4C7C5"/>
+              <w:right w:val="single" w:sz="6" w:space="0" w:color="C4C7C5"/>
+            </w:tcBorders>
+            <w:tcMar>
+              <w:top w:w="120" w:type="dxa"/>
+              <w:left w:w="180" w:type="dxa"/>
+              <w:bottom w:w="120" w:type="dxa"/>
+              <w:right w:w="180" w:type="dxa"/>
+            </w:tcMar>
+            <w:hideMark/>
+          </w:tcPr>
+          <w:p>
+            <w:r>
+              <w:rPr>
+                <w:b/>
+                <w:bCs/>
+              </w:rPr>
+              <w:t>フィールド構造</w:t>
+            </w:r>
+          </w:p>
+        </w:tc>
+        <w:tc>
+          <w:tcPr>
+            <w:tcW w:w="0" w:type="auto"/>
+            <w:tcBorders>
+              <w:top w:val="single" w:sz="6" w:space="0" w:color="C4C7C5"/>
+              <w:left w:val="single" w:sz="6" w:space="0" w:color="C4C7C5"/>
+              <w:bottom w:val="single" w:sz="6" w:space="0" w:color="C4C7C5"/>
+              <w:right w:val="single" w:sz="6" w:space="0" w:color="C4C7C5"/>
+            </w:tcBorders>
+            <w:tcMar>
+              <w:top w:w="120" w:type="dxa"/>
+              <w:left w:w="180" w:type="dxa"/>
+              <w:bottom w:w="120" w:type="dxa"/>
+              <w:right w:w="180" w:type="dxa"/>
+            </w:tcMar>
+            <w:hideMark/>
+          </w:tcPr>
+          <w:p>
+            <w:r>
+              <w:t>マップの自由移動を制限・排除し、「進む」「逃げる」といったテキスト選択のみでダンジョンを進行させる（ノンフィールド化）。</w:t>
+            </w:r>
+          </w:p>
+        </w:tc>
+        <w:tc>
+          <w:tcPr>
+            <w:tcW w:w="0" w:type="auto"/>
+            <w:tcBorders>
+              <w:top w:val="single" w:sz="6" w:space="0" w:color="C4C7C5"/>
+              <w:left w:val="single" w:sz="6" w:space="0" w:color="C4C7C5"/>
+              <w:bottom w:val="single" w:sz="6" w:space="0" w:color="C4C7C5"/>
+              <w:right w:val="single" w:sz="6" w:space="0" w:color="C4C7C5"/>
+            </w:tcBorders>
+            <w:tcMar>
+              <w:top w:w="120" w:type="dxa"/>
+              <w:left w:w="180" w:type="dxa"/>
+              <w:bottom w:w="120" w:type="dxa"/>
+              <w:right w:w="180" w:type="dxa"/>
+            </w:tcMar>
+            <w:hideMark/>
+          </w:tcPr>
+          <w:p>
+            <w:r>
+              <w:t>選択肢を削ぎ落とすことによるローグライク的緊張感の増幅と、UIの洗練。</w:t>
+            </w:r>
+          </w:p>
+        </w:tc>
+      </w:tr>
+      <w:tr>
+        <w:tc>
+          <w:tcPr>
+            <w:tcW w:w="0" w:type="auto"/>
+            <w:tcBorders>
+              <w:top w:val="single" w:sz="6" w:space="0" w:color="C4C7C5"/>
+              <w:left w:val="single" w:sz="6" w:space="0" w:color="C4C7C5"/>
+              <w:bottom w:val="single" w:sz="6" w:space="0" w:color="C4C7C5"/>
+              <w:right w:val="single" w:sz="6" w:space="0" w:color="C4C7C5"/>
+            </w:tcBorders>
+            <w:tcMar>
+              <w:top w:w="120" w:type="dxa"/>
+              <w:left w:w="180" w:type="dxa"/>
+              <w:bottom w:w="120" w:type="dxa"/>
+              <w:right w:w="180" w:type="dxa"/>
+            </w:tcMar>
+            <w:hideMark/>
+          </w:tcPr>
+          <w:p>
+            <w:r>
+              <w:rPr>
+                <w:b/>
+                <w:bCs/>
+              </w:rPr>
+              <w:t>エンカウント</w:t>
+            </w:r>
+          </w:p>
+        </w:tc>
+        <w:tc>
+          <w:tcPr>
+            <w:tcW w:w="0" w:type="auto"/>
+            <w:tcBorders>
+              <w:top w:val="single" w:sz="6" w:space="0" w:color="C4C7C5"/>
+              <w:left w:val="single" w:sz="6" w:space="0" w:color="C4C7C5"/>
+              <w:bottom w:val="single" w:sz="6" w:space="0" w:color="C4C7C5"/>
+              <w:right w:val="single" w:sz="6" w:space="0" w:color="C4C7C5"/>
+            </w:tcBorders>
+            <w:tcMar>
+              <w:top w:w="120" w:type="dxa"/>
+              <w:left w:w="180" w:type="dxa"/>
+              <w:bottom w:w="120" w:type="dxa"/>
+              <w:right w:w="180" w:type="dxa"/>
+            </w:tcMar>
+            <w:hideMark/>
+          </w:tcPr>
+          <w:p>
+            <w:r>
+              <w:t>敵に接触した方向の敵を「ストック」し、任意のタイミングで一括戦闘を行えるシステム（まとめ狩り）を導入する。</w:t>
+            </w:r>
+          </w:p>
+        </w:tc>
+        <w:tc>
+          <w:tcPr>
+            <w:tcW w:w="0" w:type="auto"/>
+            <w:tcBorders>
+              <w:top w:val="single" w:sz="6" w:space="0" w:color="C4C7C5"/>
+              <w:left w:val="single" w:sz="6" w:space="0" w:color="C4C7C5"/>
+              <w:bottom w:val="single" w:sz="6" w:space="0" w:color="C4C7C5"/>
+              <w:right w:val="single" w:sz="6" w:space="0" w:color="C4C7C5"/>
+            </w:tcBorders>
+            <w:tcMar>
+              <w:top w:w="120" w:type="dxa"/>
+              <w:left w:w="180" w:type="dxa"/>
+              <w:bottom w:w="120" w:type="dxa"/>
+              <w:right w:w="180" w:type="dxa"/>
+            </w:tcMar>
+            <w:hideMark/>
+          </w:tcPr>
+          <w:p>
+            <w:r>
+              <w:t>効率化の誘惑と、全滅リスクのチキンレースを恒常的に発生させる。</w:t>
+            </w:r>
+          </w:p>
+        </w:tc>
+      </w:tr>
+      <w:tr>
+        <w:tc>
+          <w:tcPr>
+            <w:tcW w:w="0" w:type="auto"/>
+            <w:tcBorders>
+              <w:top w:val="single" w:sz="6" w:space="0" w:color="C4C7C5"/>
+              <w:left w:val="single" w:sz="6" w:space="0" w:color="C4C7C5"/>
+              <w:bottom w:val="single" w:sz="6" w:space="0" w:color="C4C7C5"/>
+              <w:right w:val="single" w:sz="6" w:space="0" w:color="C4C7C5"/>
+            </w:tcBorders>
+            <w:tcMar>
+              <w:top w:w="120" w:type="dxa"/>
+              <w:left w:w="180" w:type="dxa"/>
+              <w:bottom w:w="120" w:type="dxa"/>
+              <w:right w:w="180" w:type="dxa"/>
+            </w:tcMar>
+            <w:hideMark/>
+          </w:tcPr>
+          <w:p>
+            <w:r>
+              <w:rPr>
+                <w:b/>
+                <w:bCs/>
+              </w:rPr>
               <w:t>リソース連携</w:t>
             </w:r>
           </w:p>
@@ -2775,53 +2604,53 @@
                 <w:b/>
                 <w:bCs/>
               </w:rPr>
-              <w:t>シミュレーション融合</w:t>
-            </w:r>
-          </w:p>
-        </w:tc>
-        <w:tc>
-          <w:tcPr>
-            <w:tcW w:w="0" w:type="auto"/>
-            <w:tcBorders>
-              <w:top w:val="single" w:sz="6" w:space="0" w:color="C4C7C5"/>
-              <w:left w:val="single" w:sz="6" w:space="0" w:color="C4C7C5"/>
-              <w:bottom w:val="single" w:sz="6" w:space="0" w:color="C4C7C5"/>
-              <w:right w:val="single" w:sz="6" w:space="0" w:color="C4C7C5"/>
-            </w:tcBorders>
-            <w:tcMar>
-              <w:top w:w="120" w:type="dxa"/>
-              <w:left w:w="180" w:type="dxa"/>
-              <w:bottom w:w="120" w:type="dxa"/>
-              <w:right w:w="180" w:type="dxa"/>
-            </w:tcMar>
-            <w:hideMark/>
-          </w:tcPr>
-          <w:p>
-            <w:r>
-              <w:t>拠点において、時間経過に伴う「空腹」「渇き」を導入し、釣り・農業等のスローライフ的行動で生存パラメーターを回復させる。</w:t>
-            </w:r>
-          </w:p>
-        </w:tc>
-        <w:tc>
-          <w:tcPr>
-            <w:tcW w:w="0" w:type="auto"/>
-            <w:tcBorders>
-              <w:top w:val="single" w:sz="6" w:space="0" w:color="C4C7C5"/>
-              <w:left w:val="single" w:sz="6" w:space="0" w:color="C4C7C5"/>
-              <w:bottom w:val="single" w:sz="6" w:space="0" w:color="C4C7C5"/>
-              <w:right w:val="single" w:sz="6" w:space="0" w:color="C4C7C5"/>
-            </w:tcBorders>
-            <w:tcMar>
-              <w:top w:w="120" w:type="dxa"/>
-              <w:left w:w="180" w:type="dxa"/>
-              <w:bottom w:w="120" w:type="dxa"/>
-              <w:right w:w="180" w:type="dxa"/>
-            </w:tcMar>
-            <w:hideMark/>
-          </w:tcPr>
-          <w:p>
-            <w:r>
-              <w:t>殺伐とした戦闘と平和な拠点運営のサイクルによるプレイ疲労の中和と、リソース管理の多層化。</w:t>
+              <w:t>制約付きカスタマイズ</w:t>
+            </w:r>
+          </w:p>
+        </w:tc>
+        <w:tc>
+          <w:tcPr>
+            <w:tcW w:w="0" w:type="auto"/>
+            <w:tcBorders>
+              <w:top w:val="single" w:sz="6" w:space="0" w:color="C4C7C5"/>
+              <w:left w:val="single" w:sz="6" w:space="0" w:color="C4C7C5"/>
+              <w:bottom w:val="single" w:sz="6" w:space="0" w:color="C4C7C5"/>
+              <w:right w:val="single" w:sz="6" w:space="0" w:color="C4C7C5"/>
+            </w:tcBorders>
+            <w:tcMar>
+              <w:top w:w="120" w:type="dxa"/>
+              <w:left w:w="180" w:type="dxa"/>
+              <w:bottom w:w="120" w:type="dxa"/>
+              <w:right w:w="180" w:type="dxa"/>
+            </w:tcMar>
+            <w:hideMark/>
+          </w:tcPr>
+          <w:p>
+            <w:r>
+              <w:t>収集したカードによるデッキ（ブック）構築や、総コスト（AP）上限付きのメダル装備システムを導入する。</w:t>
+            </w:r>
+          </w:p>
+        </w:tc>
+        <w:tc>
+          <w:tcPr>
+            <w:tcW w:w="0" w:type="auto"/>
+            <w:tcBorders>
+              <w:top w:val="single" w:sz="6" w:space="0" w:color="C4C7C5"/>
+              <w:left w:val="single" w:sz="6" w:space="0" w:color="C4C7C5"/>
+              <w:bottom w:val="single" w:sz="6" w:space="0" w:color="C4C7C5"/>
+              <w:right w:val="single" w:sz="6" w:space="0" w:color="C4C7C5"/>
+            </w:tcBorders>
+            <w:tcMar>
+              <w:top w:w="120" w:type="dxa"/>
+              <w:left w:w="180" w:type="dxa"/>
+              <w:bottom w:w="120" w:type="dxa"/>
+              <w:right w:w="180" w:type="dxa"/>
+            </w:tcMar>
+            <w:hideMark/>
+          </w:tcPr>
+          <w:p>
+            <w:r>
+              <w:t>アビリティ構成とは別軸での、パズル的なリソース管理とリアルタイム性の融合。</w:t>
             </w:r>
           </w:p>
         </w:tc>
@@ -2850,6 +2679,100 @@
                 <w:b/>
                 <w:bCs/>
               </w:rPr>
+              <w:t>シミュレーション</w:t>
+            </w:r>
+            <w:r>
+              <w:rPr>
+                <w:b/>
+                <w:bCs/>
+              </w:rPr>
+              <w:lastRenderedPageBreak/>
+              <w:t>融合</w:t>
+            </w:r>
+          </w:p>
+        </w:tc>
+        <w:tc>
+          <w:tcPr>
+            <w:tcW w:w="0" w:type="auto"/>
+            <w:tcBorders>
+              <w:top w:val="single" w:sz="6" w:space="0" w:color="C4C7C5"/>
+              <w:left w:val="single" w:sz="6" w:space="0" w:color="C4C7C5"/>
+              <w:bottom w:val="single" w:sz="6" w:space="0" w:color="C4C7C5"/>
+              <w:right w:val="single" w:sz="6" w:space="0" w:color="C4C7C5"/>
+            </w:tcBorders>
+            <w:tcMar>
+              <w:top w:w="120" w:type="dxa"/>
+              <w:left w:w="180" w:type="dxa"/>
+              <w:bottom w:w="120" w:type="dxa"/>
+              <w:right w:w="180" w:type="dxa"/>
+            </w:tcMar>
+            <w:hideMark/>
+          </w:tcPr>
+          <w:p>
+            <w:r>
+              <w:lastRenderedPageBreak/>
+              <w:t>拠点において、時間経過に伴う「空腹」「渇き」を導入し、釣り・農業等</w:t>
+            </w:r>
+            <w:r>
+              <w:lastRenderedPageBreak/>
+              <w:t>のスローライフ的行動で生存パラメーターを回復させる。</w:t>
+            </w:r>
+          </w:p>
+        </w:tc>
+        <w:tc>
+          <w:tcPr>
+            <w:tcW w:w="0" w:type="auto"/>
+            <w:tcBorders>
+              <w:top w:val="single" w:sz="6" w:space="0" w:color="C4C7C5"/>
+              <w:left w:val="single" w:sz="6" w:space="0" w:color="C4C7C5"/>
+              <w:bottom w:val="single" w:sz="6" w:space="0" w:color="C4C7C5"/>
+              <w:right w:val="single" w:sz="6" w:space="0" w:color="C4C7C5"/>
+            </w:tcBorders>
+            <w:tcMar>
+              <w:top w:w="120" w:type="dxa"/>
+              <w:left w:w="180" w:type="dxa"/>
+              <w:bottom w:w="120" w:type="dxa"/>
+              <w:right w:w="180" w:type="dxa"/>
+            </w:tcMar>
+            <w:hideMark/>
+          </w:tcPr>
+          <w:p>
+            <w:r>
+              <w:lastRenderedPageBreak/>
+              <w:t>殺伐とした戦闘と平和な拠点運営のサイクルによるプレイ</w:t>
+            </w:r>
+            <w:r>
+              <w:lastRenderedPageBreak/>
+              <w:t>疲労の中和と、リソース管理の多層化。</w:t>
+            </w:r>
+          </w:p>
+        </w:tc>
+      </w:tr>
+      <w:tr>
+        <w:tc>
+          <w:tcPr>
+            <w:tcW w:w="0" w:type="auto"/>
+            <w:tcBorders>
+              <w:top w:val="single" w:sz="6" w:space="0" w:color="C4C7C5"/>
+              <w:left w:val="single" w:sz="6" w:space="0" w:color="C4C7C5"/>
+              <w:bottom w:val="single" w:sz="6" w:space="0" w:color="C4C7C5"/>
+              <w:right w:val="single" w:sz="6" w:space="0" w:color="C4C7C5"/>
+            </w:tcBorders>
+            <w:tcMar>
+              <w:top w:w="120" w:type="dxa"/>
+              <w:left w:w="180" w:type="dxa"/>
+              <w:bottom w:w="120" w:type="dxa"/>
+              <w:right w:w="180" w:type="dxa"/>
+            </w:tcMar>
+            <w:hideMark/>
+          </w:tcPr>
+          <w:p>
+            <w:r>
+              <w:rPr>
+                <w:b/>
+                <w:bCs/>
+              </w:rPr>
+              <w:lastRenderedPageBreak/>
               <w:t>システムバイパス</w:t>
             </w:r>
           </w:p>
@@ -2976,81 +2899,6 @@
           </w:p>
         </w:tc>
       </w:tr>
-      <w:tr>
-        <w:tc>
-          <w:tcPr>
-            <w:tcW w:w="0" w:type="auto"/>
-            <w:tcBorders>
-              <w:top w:val="single" w:sz="6" w:space="0" w:color="C4C7C5"/>
-              <w:left w:val="single" w:sz="6" w:space="0" w:color="C4C7C5"/>
-              <w:bottom w:val="single" w:sz="6" w:space="0" w:color="C4C7C5"/>
-              <w:right w:val="single" w:sz="6" w:space="0" w:color="C4C7C5"/>
-            </w:tcBorders>
-            <w:tcMar>
-              <w:top w:w="120" w:type="dxa"/>
-              <w:left w:w="180" w:type="dxa"/>
-              <w:bottom w:w="120" w:type="dxa"/>
-              <w:right w:w="180" w:type="dxa"/>
-            </w:tcMar>
-            <w:hideMark/>
-          </w:tcPr>
-          <w:p>
-            <w:r>
-              <w:rPr>
-                <w:b/>
-                <w:bCs/>
-              </w:rPr>
-              <w:t>非同期オンライン</w:t>
-            </w:r>
-          </w:p>
-        </w:tc>
-        <w:tc>
-          <w:tcPr>
-            <w:tcW w:w="0" w:type="auto"/>
-            <w:tcBorders>
-              <w:top w:val="single" w:sz="6" w:space="0" w:color="C4C7C5"/>
-              <w:left w:val="single" w:sz="6" w:space="0" w:color="C4C7C5"/>
-              <w:bottom w:val="single" w:sz="6" w:space="0" w:color="C4C7C5"/>
-              <w:right w:val="single" w:sz="6" w:space="0" w:color="C4C7C5"/>
-            </w:tcBorders>
-            <w:tcMar>
-              <w:top w:w="120" w:type="dxa"/>
-              <w:left w:w="180" w:type="dxa"/>
-              <w:bottom w:w="120" w:type="dxa"/>
-              <w:right w:w="180" w:type="dxa"/>
-            </w:tcMar>
-            <w:hideMark/>
-          </w:tcPr>
-          <w:p>
-            <w:r>
-              <w:t>直接のマルチプレイを排し、他プレイヤーの痕跡（死亡位置、残したメッセージ、市場の流通）のみを共有する。</w:t>
-            </w:r>
-          </w:p>
-        </w:tc>
-        <w:tc>
-          <w:tcPr>
-            <w:tcW w:w="0" w:type="auto"/>
-            <w:tcBorders>
-              <w:top w:val="single" w:sz="6" w:space="0" w:color="C4C7C5"/>
-              <w:left w:val="single" w:sz="6" w:space="0" w:color="C4C7C5"/>
-              <w:bottom w:val="single" w:sz="6" w:space="0" w:color="C4C7C5"/>
-              <w:right w:val="single" w:sz="6" w:space="0" w:color="C4C7C5"/>
-            </w:tcBorders>
-            <w:tcMar>
-              <w:top w:w="120" w:type="dxa"/>
-              <w:left w:w="180" w:type="dxa"/>
-              <w:bottom w:w="120" w:type="dxa"/>
-              <w:right w:w="180" w:type="dxa"/>
-            </w:tcMar>
-            <w:hideMark/>
-          </w:tcPr>
-          <w:p>
-            <w:r>
-              <w:t>ソロプレイの孤独感を緩和しつつ、自らのビルド成果を間接的に誇示する承認欲求の受け皿を作る。</w:t>
-            </w:r>
-          </w:p>
-        </w:tc>
-      </w:tr>
     </w:tbl>
     <w:p>
       <w:pPr>
@@ -3064,7 +2912,6 @@
           <w:b/>
           <w:bCs/>
         </w:rPr>
-        <w:lastRenderedPageBreak/>
         <w:t>7. 結論</w:t>
       </w:r>
     </w:p>
@@ -3077,7 +2924,7 @@
           <w:b/>
           <w:bCs/>
         </w:rPr>
-        <w:t>「極限まで無駄を削ぎ落とした超高速のフィードバック（戦闘）」と、「複合的で論理的なパラメーターパズル（育成）」</w:t>
+        <w:t>「極限まで無駄を削ぎ落とした超高速のフィードバック（戦闘）」と、「複合的で論理的なパラメーター・コストパズル（育成・構築）」</w:t>
       </w:r>
       <w:r>
         <w:t>、そして「探索・移動・生活までもが戦略的リソースに結びつく統合的システム（シミュレーションの融合）」という三位一体のゲームデザインにある。</w:t>
@@ -3090,7 +2937,7 @@
     </w:p>
     <w:p>
       <w:r>
-        <w:t>ゲーム制作のプロンプトを作成する際は、表面的な「ハクスラ」や「やり込み」といった抽象的な単語に留まらず、本稿の表に抽出した「移動と戦闘のSP共有」「スタックによるリスク管理」「装備の圧倒的な倍率恩恵」「精神パラメーターによる防御とバフの統合」といった具体的なメカニクス（仕様）をシステム要件としてAIや開発チームに指示すべきである。これにより、アンディーメンテ作品が持つ、底なし沼のような「深淵なるデータの渦への没入感」を理論的に再現することが可能となるだろう。</w:t>
+        <w:t>ゲーム制作のプロンプトを作成する際は、表面的な「ハクスラ」や「やり込み」といった抽象的な単語に留まらず、本稿の表に抽出した「移動と戦闘のSP共有」「ノンフィールドでの限定的選択」「コスト制のメダルカスタマイズ」といった具体的なメカニクス（仕様）をシステム要件としてAIや開発チームに指示すべきである。これにより、アンディーメンテ作品が持つ、底なし沼のような「深淵なるデータの渦への没入感」を理論的に再現することが可能となるだろう。</w:t>
       </w:r>
     </w:p>
     <w:p>
@@ -3112,18 +2959,18 @@
       <w:pPr>
         <w:numPr>
           <w:ilvl w:val="0"/>
-          <w:numId w:val="1"/>
+          <w:numId w:val="2"/>
         </w:numPr>
       </w:pPr>
       <w:r>
-        <w:t xml:space="preserve">アンディー・メンテ作品がSteamに登場『Vampire Bloody Star X』配信開始【UPDATE】, </w:t>
+        <w:t xml:space="preserve">RPGを簡単に作る方法 - 2dgames.jp, </w:t>
       </w:r>
       <w:hyperlink r:id="rId5" w:history="1">
         <w:r>
           <w:rPr>
             <w:rStyle w:val="aa"/>
           </w:rPr>
-          <w:t>https://www.gamespark.jp/article/2018/11/09/85177.html</w:t>
+          <w:t>https://2dgames.jp/entry/easy-rpg/</w:t>
         </w:r>
       </w:hyperlink>
     </w:p>
@@ -3131,18 +2978,18 @@
       <w:pPr>
         <w:numPr>
           <w:ilvl w:val="0"/>
-          <w:numId w:val="1"/>
+          <w:numId w:val="2"/>
         </w:numPr>
       </w:pPr>
       <w:r>
-        <w:t xml:space="preserve">アンディーメンテ新作の島開拓シム『きみの島 -KIMI NO SIMA-』PC向けに正式リリース, </w:t>
+        <w:t xml:space="preserve">【特集】『良作フリーゲーム』10選―無料でこんなに遊べるのか！ - インサイド, </w:t>
       </w:r>
       <w:hyperlink r:id="rId6" w:history="1">
         <w:r>
           <w:rPr>
             <w:rStyle w:val="aa"/>
           </w:rPr>
-          <w:t>https://www.gamespark.jp/article/2019/10/17/93930.html</w:t>
+          <w:t>https://www.inside-games.jp/article/2016/08/31/101429_2.html</w:t>
         </w:r>
       </w:hyperlink>
     </w:p>
@@ -3150,18 +2997,25 @@
       <w:pPr>
         <w:numPr>
           <w:ilvl w:val="0"/>
-          <w:numId w:val="1"/>
+          <w:numId w:val="2"/>
         </w:numPr>
       </w:pPr>
       <w:r>
-        <w:t xml:space="preserve">作者: 泉 和良 - Vector, </w:t>
+        <w:t xml:space="preserve">神メダル - 混沌のルーシーWiki, </w:t>
       </w:r>
       <w:hyperlink r:id="rId7" w:history="1">
         <w:r>
           <w:rPr>
             <w:rStyle w:val="aa"/>
           </w:rPr>
-          <w:t>https://www.vector.co.jp/vpack/browse/person/an016116.html</w:t>
+          <w:t>https://chaoslucy.wiki.fc2.com/m/wiki/%E7%A5%9E%E3%83%A1%E3%83%80</w:t>
+        </w:r>
+        <w:r>
+          <w:rPr>
+            <w:rStyle w:val="aa"/>
+          </w:rPr>
+          <w:lastRenderedPageBreak/>
+          <w:t>%E3%83%AB</w:t>
         </w:r>
       </w:hyperlink>
     </w:p>
@@ -3169,18 +3023,18 @@
       <w:pPr>
         <w:numPr>
           <w:ilvl w:val="0"/>
-          <w:numId w:val="1"/>
+          <w:numId w:val="2"/>
         </w:numPr>
       </w:pPr>
       <w:r>
-        <w:t xml:space="preserve">アンディー・メンテ・ゲーム, </w:t>
+        <w:t xml:space="preserve">混沌のルーシー：無料ゲーム配信中！ [ふりーむ！], </w:t>
       </w:r>
       <w:hyperlink r:id="rId8" w:history="1">
         <w:r>
           <w:rPr>
             <w:rStyle w:val="aa"/>
           </w:rPr>
-          <w:t>http://andymente.moo.jp/html/free12.htm</w:t>
+          <w:t>https://www.freem.ne.jp/win/game/8320</w:t>
         </w:r>
       </w:hyperlink>
     </w:p>
@@ -3188,265 +3042,18 @@
       <w:pPr>
         <w:numPr>
           <w:ilvl w:val="0"/>
-          <w:numId w:val="1"/>
+          <w:numId w:val="2"/>
         </w:numPr>
       </w:pPr>
       <w:r>
-        <w:t xml:space="preserve">アンディーメンテ・ヘブンズ 公開フリーゲーム一覧 by ふりーむ！, </w:t>
+        <w:t xml:space="preserve">テキスト - アンディーメンテ, </w:t>
       </w:r>
       <w:hyperlink r:id="rId9" w:history="1">
         <w:r>
           <w:rPr>
             <w:rStyle w:val="aa"/>
           </w:rPr>
-          <w:t>https://www.freem.ne.jp/brand/6824</w:t>
-        </w:r>
-      </w:hyperlink>
-    </w:p>
-    <w:p>
-      <w:pPr>
-        <w:numPr>
-          <w:ilvl w:val="0"/>
-          <w:numId w:val="1"/>
-        </w:numPr>
-      </w:pPr>
-      <w:r>
-        <w:t xml:space="preserve">ガラテアの詳細情報 : Vector ソフトを探す！, </w:t>
-      </w:r>
-      <w:hyperlink r:id="rId10" w:history="1">
-        <w:r>
-          <w:rPr>
-            <w:rStyle w:val="aa"/>
-          </w:rPr>
-          <w:t>https://www.vector.co.jp/soft/win95/game/se166472.html</w:t>
-        </w:r>
-      </w:hyperlink>
-    </w:p>
-    <w:p>
-      <w:pPr>
-        <w:numPr>
-          <w:ilvl w:val="0"/>
-          <w:numId w:val="1"/>
-        </w:numPr>
-      </w:pPr>
-      <w:r>
-        <w:t xml:space="preserve">アールエス：無料ゲーム配信中！ [ふりーむ！], </w:t>
-      </w:r>
-      <w:hyperlink r:id="rId11" w:history="1">
-        <w:r>
-          <w:rPr>
-            <w:rStyle w:val="aa"/>
-          </w:rPr>
-          <w:t>https://www.freem.ne.jp/win/game/19941</w:t>
-        </w:r>
-      </w:hyperlink>
-    </w:p>
-    <w:p>
-      <w:pPr>
-        <w:numPr>
-          <w:ilvl w:val="0"/>
-          <w:numId w:val="1"/>
-        </w:numPr>
-      </w:pPr>
-      <w:r>
-        <w:t xml:space="preserve">moudameder :: Games - Steam Community, </w:t>
-      </w:r>
-      <w:hyperlink r:id="rId12" w:history="1">
-        <w:r>
-          <w:rPr>
-            <w:rStyle w:val="aa"/>
-          </w:rPr>
-          <w:t>https://steamcommunity.com/id/moudameder/recommended/</w:t>
-        </w:r>
-      </w:hyperlink>
-    </w:p>
-    <w:p>
-      <w:pPr>
-        <w:numPr>
-          <w:ilvl w:val="0"/>
-          <w:numId w:val="1"/>
-        </w:numPr>
-      </w:pPr>
-      <w:r>
-        <w:t xml:space="preserve">1990～2010年の名作フリーゲーム｜kamioka - note, </w:t>
-      </w:r>
-      <w:hyperlink r:id="rId13" w:history="1">
-        <w:r>
-          <w:rPr>
-            <w:rStyle w:val="aa"/>
-          </w:rPr>
-          <w:t>https://note.com/trdd/n/n5bd04622ed15</w:t>
-        </w:r>
-      </w:hyperlink>
-    </w:p>
-    <w:p>
-      <w:pPr>
-        <w:numPr>
-          <w:ilvl w:val="0"/>
-          <w:numId w:val="1"/>
-        </w:numPr>
-      </w:pPr>
-      <w:r>
-        <w:t xml:space="preserve">投稿レビュー RPG １０ - フリーソフト超激辛ゲームレビュー, </w:t>
-      </w:r>
-      <w:hyperlink r:id="rId14" w:history="1">
-        <w:r>
-          <w:rPr>
-            <w:rStyle w:val="aa"/>
-          </w:rPr>
-          <w:t>https://gekikarareview.com/review_rpg/rpg_toukou010.html</w:t>
-        </w:r>
-      </w:hyperlink>
-    </w:p>
-    <w:p>
-      <w:pPr>
-        <w:numPr>
-          <w:ilvl w:val="0"/>
-          <w:numId w:val="1"/>
-        </w:numPr>
-      </w:pPr>
-      <w:r>
-        <w:t xml:space="preserve">投稿レビュー RPG １１ - フリーソフト超激辛ゲームレビュー, </w:t>
-      </w:r>
-      <w:hyperlink r:id="rId15" w:history="1">
-        <w:r>
-          <w:rPr>
-            <w:rStyle w:val="aa"/>
-          </w:rPr>
-          <w:t>https://gekikarareview.com/review_rpg/rpg_toukou011.html</w:t>
-        </w:r>
-      </w:hyperlink>
-    </w:p>
-    <w:p>
-      <w:pPr>
-        <w:numPr>
-          <w:ilvl w:val="0"/>
-          <w:numId w:val="1"/>
-        </w:numPr>
-      </w:pPr>
-      <w:r>
-        <w:t xml:space="preserve">【伺的アドカレ】磯野～！オリキャラゲーやろうぜ！の記事。｜マグロニウム/Dr.オズワルド - note, </w:t>
-      </w:r>
-      <w:hyperlink r:id="rId16" w:history="1">
-        <w:r>
-          <w:rPr>
-            <w:rStyle w:val="aa"/>
-          </w:rPr>
-          <w:t>https://note.com/wizard_of_ozwald/n/n48d67a7b2585</w:t>
-        </w:r>
-      </w:hyperlink>
-    </w:p>
-    <w:p>
-      <w:pPr>
-        <w:numPr>
-          <w:ilvl w:val="0"/>
-          <w:numId w:val="1"/>
-        </w:numPr>
-      </w:pPr>
-      <w:r>
-        <w:t xml:space="preserve">ライヂング スター・レジェンド RETURNS：無料ゲーム配信中！ [ふりーむ！], </w:t>
-      </w:r>
-      <w:hyperlink r:id="rId17" w:history="1">
-        <w:r>
-          <w:rPr>
-            <w:rStyle w:val="aa"/>
-          </w:rPr>
-          <w:t>https://www.freem.ne.jp/win/game/5310</w:t>
-        </w:r>
-      </w:hyperlink>
-    </w:p>
-    <w:p>
-      <w:pPr>
-        <w:numPr>
-          <w:ilvl w:val="0"/>
-          <w:numId w:val="1"/>
-        </w:numPr>
-      </w:pPr>
-      <w:r>
-        <w:t xml:space="preserve">[フリーゲーム] アンディーメンテ, </w:t>
-      </w:r>
-      <w:hyperlink r:id="rId18" w:history="1">
-        <w:r>
-          <w:rPr>
-            <w:rStyle w:val="aa"/>
-          </w:rPr>
-          <w:t>https://andymente.moo.jp/</w:t>
-        </w:r>
-      </w:hyperlink>
-    </w:p>
-    <w:p>
-      <w:pPr>
-        <w:numPr>
-          <w:ilvl w:val="0"/>
-          <w:numId w:val="1"/>
-        </w:numPr>
-      </w:pPr>
-      <w:r>
-        <w:t xml:space="preserve">ノンフィールドRPG - イブニングパークと子供達の階差アプリ - App Store, </w:t>
-      </w:r>
-      <w:hyperlink r:id="rId19" w:history="1">
-        <w:r>
-          <w:rPr>
-            <w:rStyle w:val="aa"/>
-          </w:rPr>
-          <w:t>https://apps.apple.com/jp/app/%E3%83%8E%E3%83%B3%E3%83%95%E3%82%A3%E3%83%BC%E3%83%AB%E3%83%89rpg-%E3%82%A4%E3%83%96%E3%83%8B%E3%83%B3%E3%82%B0%E3%83%91%E3%83%BC%E3%82%AF%E3%81%A8%E5%AD%90%E4%BE%9B%E9%81%94%E3%81%AE%E9%9A%8E%E5%B7%AE/id1439418500</w:t>
-        </w:r>
-      </w:hyperlink>
-    </w:p>
-    <w:p>
-      <w:pPr>
-        <w:numPr>
-          <w:ilvl w:val="0"/>
-          <w:numId w:val="1"/>
-        </w:numPr>
-      </w:pPr>
-      <w:r>
-        <w:t xml:space="preserve">“小麦から作る”ほのぼのパン屋経営ゲーム『絵本の中のパン屋さん』2月21日早期アクセス配信へ。森の動物たちにパンを売る、アンディーメンテ新作 - AUTOMATON, </w:t>
-      </w:r>
-      <w:hyperlink r:id="rId20" w:history="1">
-        <w:r>
-          <w:rPr>
-            <w:rStyle w:val="aa"/>
-          </w:rPr>
-          <w:t>https://automaton-media.com/articles/newsjp/20260217-421795/</w:t>
-        </w:r>
-      </w:hyperlink>
-    </w:p>
-    <w:p>
-      <w:pPr>
-        <w:numPr>
-          <w:ilvl w:val="0"/>
-          <w:numId w:val="1"/>
-        </w:numPr>
-      </w:pPr>
-      <w:r>
-        <w:t xml:space="preserve">ノンフィールドRPG - イブニングパークと子供達の階差 - 評価とレビュー - App Store - Apple, </w:t>
-      </w:r>
-      <w:hyperlink r:id="rId21" w:history="1">
-        <w:r>
-          <w:rPr>
-            <w:rStyle w:val="aa"/>
-          </w:rPr>
-          <w:t>https://apps.apple.com/jp/app/1439418500?see-all=reviews&amp;platform=iphone</w:t>
-        </w:r>
-      </w:hyperlink>
-    </w:p>
-    <w:p>
-      <w:pPr>
-        <w:numPr>
-          <w:ilvl w:val="0"/>
-          <w:numId w:val="1"/>
-        </w:numPr>
-      </w:pPr>
-      <w:r>
-        <w:t xml:space="preserve">アンディーメンテ 公開フリーゲーム一覧 by ふりーむ！, </w:t>
-      </w:r>
-      <w:hyperlink r:id="rId22" w:history="1">
-        <w:r>
-          <w:rPr>
-            <w:rStyle w:val="aa"/>
-          </w:rPr>
-          <w:t>https://www.freem.ne.jp/brand/1676</w:t>
+          <w:t>http://andymente.moo.jp/html/top_message.htm</w:t>
         </w:r>
       </w:hyperlink>
     </w:p>
@@ -3576,8 +3183,124 @@
       </w:pPr>
     </w:lvl>
   </w:abstractNum>
+  <w:abstractNum w:abstractNumId="1" w15:restartNumberingAfterBreak="0">
+    <w:nsid w:val="2B504A6D"/>
+    <w:multiLevelType w:val="multilevel"/>
+    <w:tmpl w:val="EBD03056"/>
+    <w:lvl w:ilvl="0">
+      <w:start w:val="1"/>
+      <w:numFmt w:val="decimal"/>
+      <w:lvlText w:val="%1."/>
+      <w:lvlJc w:val="left"/>
+      <w:pPr>
+        <w:tabs>
+          <w:tab w:val="num" w:pos="720"/>
+        </w:tabs>
+        <w:ind w:left="720" w:hanging="360"/>
+      </w:pPr>
+    </w:lvl>
+    <w:lvl w:ilvl="1" w:tentative="1">
+      <w:start w:val="1"/>
+      <w:numFmt w:val="decimal"/>
+      <w:lvlText w:val="%2."/>
+      <w:lvlJc w:val="left"/>
+      <w:pPr>
+        <w:tabs>
+          <w:tab w:val="num" w:pos="1440"/>
+        </w:tabs>
+        <w:ind w:left="1440" w:hanging="360"/>
+      </w:pPr>
+    </w:lvl>
+    <w:lvl w:ilvl="2" w:tentative="1">
+      <w:start w:val="1"/>
+      <w:numFmt w:val="decimal"/>
+      <w:lvlText w:val="%3."/>
+      <w:lvlJc w:val="left"/>
+      <w:pPr>
+        <w:tabs>
+          <w:tab w:val="num" w:pos="2160"/>
+        </w:tabs>
+        <w:ind w:left="2160" w:hanging="360"/>
+      </w:pPr>
+    </w:lvl>
+    <w:lvl w:ilvl="3" w:tentative="1">
+      <w:start w:val="1"/>
+      <w:numFmt w:val="decimal"/>
+      <w:lvlText w:val="%4."/>
+      <w:lvlJc w:val="left"/>
+      <w:pPr>
+        <w:tabs>
+          <w:tab w:val="num" w:pos="2880"/>
+        </w:tabs>
+        <w:ind w:left="2880" w:hanging="360"/>
+      </w:pPr>
+    </w:lvl>
+    <w:lvl w:ilvl="4" w:tentative="1">
+      <w:start w:val="1"/>
+      <w:numFmt w:val="decimal"/>
+      <w:lvlText w:val="%5."/>
+      <w:lvlJc w:val="left"/>
+      <w:pPr>
+        <w:tabs>
+          <w:tab w:val="num" w:pos="3600"/>
+        </w:tabs>
+        <w:ind w:left="3600" w:hanging="360"/>
+      </w:pPr>
+    </w:lvl>
+    <w:lvl w:ilvl="5" w:tentative="1">
+      <w:start w:val="1"/>
+      <w:numFmt w:val="decimal"/>
+      <w:lvlText w:val="%6."/>
+      <w:lvlJc w:val="left"/>
+      <w:pPr>
+        <w:tabs>
+          <w:tab w:val="num" w:pos="4320"/>
+        </w:tabs>
+        <w:ind w:left="4320" w:hanging="360"/>
+      </w:pPr>
+    </w:lvl>
+    <w:lvl w:ilvl="6" w:tentative="1">
+      <w:start w:val="1"/>
+      <w:numFmt w:val="decimal"/>
+      <w:lvlText w:val="%7."/>
+      <w:lvlJc w:val="left"/>
+      <w:pPr>
+        <w:tabs>
+          <w:tab w:val="num" w:pos="5040"/>
+        </w:tabs>
+        <w:ind w:left="5040" w:hanging="360"/>
+      </w:pPr>
+    </w:lvl>
+    <w:lvl w:ilvl="7" w:tentative="1">
+      <w:start w:val="1"/>
+      <w:numFmt w:val="decimal"/>
+      <w:lvlText w:val="%8."/>
+      <w:lvlJc w:val="left"/>
+      <w:pPr>
+        <w:tabs>
+          <w:tab w:val="num" w:pos="5760"/>
+        </w:tabs>
+        <w:ind w:left="5760" w:hanging="360"/>
+      </w:pPr>
+    </w:lvl>
+    <w:lvl w:ilvl="8" w:tentative="1">
+      <w:start w:val="1"/>
+      <w:numFmt w:val="decimal"/>
+      <w:lvlText w:val="%9."/>
+      <w:lvlJc w:val="left"/>
+      <w:pPr>
+        <w:tabs>
+          <w:tab w:val="num" w:pos="6480"/>
+        </w:tabs>
+        <w:ind w:left="6480" w:hanging="360"/>
+      </w:pPr>
+    </w:lvl>
+  </w:abstractNum>
   <w:num w:numId="1" w16cid:durableId="386538127">
     <w:abstractNumId w:val="0"/>
+  </w:num>
+  <w:num w:numId="2" w16cid:durableId="1565220801">
+    <w:abstractNumId w:val="1"/>
   </w:num>
 </w:numbering>
 </file>

</xml_diff>